<commit_message>
docs: manual de usuario reorganizado por jerarquia de roles
Expande el manual de usuario con pasos numerados por pantalla, organizado
estrictamente Administrador > Recepcion > Barbero > Cliente, mas secciones
de notificaciones, chatbot y preguntas frecuentes. Mas espacios marcados
para capturas de pantalla que la version anterior.

Co-Authored-By: Claude Sonnet 5 <noreply@anthropic.com>
</commit_message>
<xml_diff>
--- a/docs/word/UrbanBlade_Manual_Usuario.docx
+++ b/docs/word/UrbanBlade_Manual_Usuario.docx
@@ -51,7 +51,7 @@
           <w:sz w:val="26"/>
           <w:szCs w:val="26"/>
         </w:rPr>
-        <w:t xml:space="preserve">Guía de uso del sistema, organizada por rol</w:t>
+        <w:t xml:space="preserve">Guía completa de uso por rol y jerarquía</w:t>
       </w:r>
     </w:p>
     <w:p>
@@ -65,7 +65,7 @@
           <w:sz w:val="22"/>
           <w:szCs w:val="22"/>
         </w:rPr>
-        <w:t xml:space="preserve">Cliente · Barbero · Recepción · Administrador</w:t>
+        <w:t xml:space="preserve">Administrador → Recepción → Barbero → Cliente</w:t>
       </w:r>
     </w:p>
     <w:p>
@@ -138,59 +138,44 @@
         <w:pStyle w:val="Heading1"/>
       </w:pPr>
       <w:r>
-        <w:t xml:space="preserve">1. Ingresar al sistema</w:t>
-      </w:r>
-    </w:p>
-    <w:p>
-      <w:pPr>
-        <w:pStyle w:val="ListParagraph"/>
-        <w:numPr>
-          <w:ilvl w:val="0"/>
-          <w:numId w:val="2"/>
-        </w:numPr>
-        <w:spacing w:after="80"/>
-      </w:pPr>
-      <w:r>
-        <w:t xml:space="preserve">Abre la dirección de la barbería en tu navegador.</w:t>
-      </w:r>
-    </w:p>
-    <w:p>
-      <w:pPr>
-        <w:pStyle w:val="ListParagraph"/>
-        <w:numPr>
-          <w:ilvl w:val="0"/>
-          <w:numId w:val="2"/>
-        </w:numPr>
-        <w:spacing w:after="80"/>
-      </w:pPr>
-      <w:r>
-        <w:t xml:space="preserve">Pulsa Acceso (esquina superior derecha) e introduce tu correo y contraseña.</w:t>
-      </w:r>
-    </w:p>
-    <w:p>
-      <w:pPr>
-        <w:pStyle w:val="ListParagraph"/>
-        <w:numPr>
-          <w:ilvl w:val="0"/>
-          <w:numId w:val="2"/>
-        </w:numPr>
-        <w:spacing w:after="80"/>
-      </w:pPr>
-      <w:r>
-        <w:t xml:space="preserve">Si eres cliente nuevo, pulsa Reservar en la página principal para crear tu cuenta.</w:t>
-      </w:r>
-    </w:p>
-    <w:p>
-      <w:pPr>
-        <w:pStyle w:val="ListParagraph"/>
-        <w:numPr>
-          <w:ilvl w:val="0"/>
-          <w:numId w:val="2"/>
-        </w:numPr>
-        <w:spacing w:after="80"/>
-      </w:pPr>
-      <w:r>
-        <w:t xml:space="preserve">Al entrar verás tu panel principal, distinto según tu rol: Administrador, Recepción, Barbero o Cliente.</w:t>
+        <w:t xml:space="preserve">0. Cómo usar este manual</w:t>
+      </w:r>
+    </w:p>
+    <w:p>
+      <w:pPr>
+        <w:spacing w:after="160"/>
+      </w:pPr>
+      <w:r>
+        <w:t xml:space="preserve">Este manual está organizado por jerarquía de roles, de mayor a menor nivel de acceso: Administrador (control total del sistema), Recepción (operación diaria), Barbero (autogestión de su agenda y perfil), y Cliente (autoservicio). Cada rol solo ve en la aplicación las opciones que le corresponden — si iniciaste sesión con una cuenta de cliente, por ejemplo, no verás el menú de Inventario ni el de Usuarios, porque no aplican a tu rol.</w:t>
+      </w:r>
+    </w:p>
+    <w:p>
+      <w:pPr>
+        <w:spacing w:after="160"/>
+      </w:pPr>
+      <w:r>
+        <w:t xml:space="preserve">Cada sección incluye los pasos exactos a seguir, capturado en el mismo orden en que aparecen los botones/menús reales del sistema, y un recuadro marcado para que insertes tu propia captura de pantalla de esa acción.</w:t>
+      </w:r>
+    </w:p>
+    <w:p>
+      <w:pPr>
+        <w:pBdr>
+          <w:left w:val="single" w:color="B8860B" w:sz="24" w:space="8"/>
+        </w:pBdr>
+        <w:shd w:fill="F2F2F2" w:val="clear"/>
+        <w:spacing w:after="200" w:before="160"/>
+        <w:ind w:left="120"/>
+      </w:pPr>
+      <w:r>
+        <w:rPr>
+          <w:b/>
+          <w:bCs/>
+          <w:color w:val="B8860B"/>
+        </w:rPr>
+        <w:t xml:space="preserve">Jerarquía de acceso:  </w:t>
+      </w:r>
+      <w:r>
+        <w:t xml:space="preserve"> Administrador &gt; Recepción &gt; Barbero &gt; Cliente. El administrador puede ver y hacer todo lo que hacen los demás roles, además de la gestión completa del negocio; cada rol por debajo tiene un alcance más acotado y enfocado en su función específica.</w:t>
       </w:r>
     </w:p>
     <w:p>
@@ -247,6 +232,84 @@
       </w:r>
     </w:p>
     <w:p>
+      <w:r>
+        <w:br w:type="page"/>
+      </w:r>
+    </w:p>
+    <w:p>
+      <w:pPr>
+        <w:pStyle w:val="Heading1"/>
+      </w:pPr>
+      <w:r>
+        <w:t xml:space="preserve">1. Ingresar al sistema (todos los roles)</w:t>
+      </w:r>
+    </w:p>
+    <w:p>
+      <w:pPr>
+        <w:pStyle w:val="ListParagraph"/>
+        <w:numPr>
+          <w:ilvl w:val="0"/>
+          <w:numId w:val="2"/>
+        </w:numPr>
+        <w:spacing w:after="80"/>
+      </w:pPr>
+      <w:r>
+        <w:t xml:space="preserve">Abre la dirección de la barbería en tu navegador.</w:t>
+      </w:r>
+    </w:p>
+    <w:p>
+      <w:pPr>
+        <w:pStyle w:val="ListParagraph"/>
+        <w:numPr>
+          <w:ilvl w:val="0"/>
+          <w:numId w:val="2"/>
+        </w:numPr>
+        <w:spacing w:after="80"/>
+      </w:pPr>
+      <w:r>
+        <w:t xml:space="preserve">Pulsa Acceso (esquina superior derecha) e introduce tu correo y contraseña.</w:t>
+      </w:r>
+    </w:p>
+    <w:p>
+      <w:pPr>
+        <w:pStyle w:val="ListParagraph"/>
+        <w:numPr>
+          <w:ilvl w:val="0"/>
+          <w:numId w:val="2"/>
+        </w:numPr>
+        <w:spacing w:after="80"/>
+      </w:pPr>
+      <w:r>
+        <w:t xml:space="preserve">Si eres cliente nuevo, pulsa Reservar en la página principal para crear tu cuenta — no necesitas que un administrador te dé de alta.</w:t>
+      </w:r>
+    </w:p>
+    <w:p>
+      <w:pPr>
+        <w:pStyle w:val="ListParagraph"/>
+        <w:numPr>
+          <w:ilvl w:val="0"/>
+          <w:numId w:val="2"/>
+        </w:numPr>
+        <w:spacing w:after="80"/>
+      </w:pPr>
+      <w:r>
+        <w:t xml:space="preserve">Al entrar, el sistema detecta automáticamente tu rol y te muestra el panel correspondiente: Administrador, Recepción, Barbero o Cliente. El menú lateral (sidebar) cambia según tu rol.</w:t>
+      </w:r>
+    </w:p>
+    <w:p>
+      <w:pPr>
+        <w:pStyle w:val="ListParagraph"/>
+        <w:numPr>
+          <w:ilvl w:val="0"/>
+          <w:numId w:val="2"/>
+        </w:numPr>
+        <w:spacing w:after="80"/>
+      </w:pPr>
+      <w:r>
+        <w:t xml:space="preserve">Si olvidaste tu contraseña, usa la opción ¿Olvidaste tu contraseña? en la pantalla de acceso — recibirás un correo con un enlace para restablecerla.</w:t>
+      </w:r>
+    </w:p>
+    <w:p>
       <w:pPr>
         <w:pBdr>
           <w:top w:val="dashed" w:color="999999" w:sz="8" w:space="8"/>
@@ -300,79 +363,6 @@
       </w:r>
     </w:p>
     <w:p>
-      <w:r>
-        <w:br w:type="page"/>
-      </w:r>
-    </w:p>
-    <w:p>
-      <w:pPr>
-        <w:pStyle w:val="Heading1"/>
-      </w:pPr>
-      <w:r>
-        <w:t xml:space="preserve">2. Rol: Cliente</w:t>
-      </w:r>
-    </w:p>
-    <w:p>
-      <w:pPr>
-        <w:pStyle w:val="Heading2"/>
-      </w:pPr>
-      <w:r>
-        <w:t xml:space="preserve">2.1 Reservar una cita</w:t>
-      </w:r>
-    </w:p>
-    <w:p>
-      <w:pPr>
-        <w:pStyle w:val="ListParagraph"/>
-        <w:numPr>
-          <w:ilvl w:val="0"/>
-          <w:numId w:val="2"/>
-        </w:numPr>
-        <w:spacing w:after="80"/>
-      </w:pPr>
-      <w:r>
-        <w:t xml:space="preserve">En el menú, ve a Reservar cita.</w:t>
-      </w:r>
-    </w:p>
-    <w:p>
-      <w:pPr>
-        <w:pStyle w:val="ListParagraph"/>
-        <w:numPr>
-          <w:ilvl w:val="0"/>
-          <w:numId w:val="2"/>
-        </w:numPr>
-        <w:spacing w:after="80"/>
-      </w:pPr>
-      <w:r>
-        <w:t xml:space="preserve">Sigue el asistente paso a paso: elige el servicio, el barbero (o "sin preferencia"), la fecha (los domingos no están disponibles) y la hora. Un resumen de tu selección queda siempre visible mientras avanzas, y puedes volver a cualquier paso anterior con un clic.</w:t>
-      </w:r>
-    </w:p>
-    <w:p>
-      <w:pPr>
-        <w:pStyle w:val="ListParagraph"/>
-        <w:numPr>
-          <w:ilvl w:val="0"/>
-          <w:numId w:val="2"/>
-        </w:numPr>
-        <w:spacing w:after="80"/>
-      </w:pPr>
-      <w:r>
-        <w:t xml:space="preserve">Opcionalmente puedes añadir productos a tu cita en el mismo asistente.</w:t>
-      </w:r>
-    </w:p>
-    <w:p>
-      <w:pPr>
-        <w:pStyle w:val="ListParagraph"/>
-        <w:numPr>
-          <w:ilvl w:val="0"/>
-          <w:numId w:val="2"/>
-        </w:numPr>
-        <w:spacing w:after="80"/>
-      </w:pPr>
-      <w:r>
-        <w:t xml:space="preserve">Confirma. Tu cita queda en estado pendiente hasta que el barbero la apruebe — recibirás una notificación cuando eso ocurra.</w:t>
-      </w:r>
-    </w:p>
-    <w:p>
       <w:pPr>
         <w:pBdr>
           <w:top w:val="dashed" w:color="999999" w:sz="8" w:space="8"/>
@@ -422,7 +412,83 @@
           <w:sz w:val="20"/>
           <w:szCs w:val="20"/>
         </w:rPr>
-        <w:t xml:space="preserve">Asistente de reserva — selección de servicio y barbero.</w:t>
+        <w:t xml:space="preserve">Menú lateral (sidebar) de cada uno de los 4 roles, para comparar.</w:t>
+      </w:r>
+    </w:p>
+    <w:p>
+      <w:r>
+        <w:br w:type="page"/>
+      </w:r>
+    </w:p>
+    <w:p>
+      <w:pPr>
+        <w:pStyle w:val="Heading1"/>
+      </w:pPr>
+      <w:r>
+        <w:t xml:space="preserve">2. Rol: Administrador</w:t>
+      </w:r>
+    </w:p>
+    <w:p>
+      <w:pPr>
+        <w:spacing w:after="160"/>
+      </w:pPr>
+      <w:r>
+        <w:t xml:space="preserve">El administrador tiene control total del sistema: gestión de personal, catálogo, inventario, configuración del negocio, reportes, campañas de marketing, bitácora de auditoría y respaldo de la base de datos.</w:t>
+      </w:r>
+    </w:p>
+    <w:p>
+      <w:pPr>
+        <w:pStyle w:val="Heading2"/>
+      </w:pPr>
+      <w:r>
+        <w:t xml:space="preserve">2.1 Panel principal</w:t>
+      </w:r>
+    </w:p>
+    <w:p>
+      <w:pPr>
+        <w:spacing w:after="160"/>
+      </w:pPr>
+      <w:r>
+        <w:t xml:space="preserve">El panel del administrador está organizado en tres zonas:</w:t>
+      </w:r>
+    </w:p>
+    <w:p>
+      <w:pPr>
+        <w:pStyle w:val="ListParagraph"/>
+        <w:numPr>
+          <w:ilvl w:val="0"/>
+          <w:numId w:val="2"/>
+        </w:numPr>
+        <w:spacing w:after="80"/>
+      </w:pPr>
+      <w:r>
+        <w:t xml:space="preserve">Resumen del negocio — KPIs del día/mes: citas, ingresos, clientes activos, retención.</w:t>
+      </w:r>
+    </w:p>
+    <w:p>
+      <w:pPr>
+        <w:pStyle w:val="ListParagraph"/>
+        <w:numPr>
+          <w:ilvl w:val="0"/>
+          <w:numId w:val="2"/>
+        </w:numPr>
+        <w:spacing w:after="80"/>
+      </w:pPr>
+      <w:r>
+        <w:t xml:space="preserve">Insights del análisis de datos — 3 tarjetas con hallazgos automáticos: segmento premium, cancelaciones del mes, hora pico.</w:t>
+      </w:r>
+    </w:p>
+    <w:p>
+      <w:pPr>
+        <w:pStyle w:val="ListParagraph"/>
+        <w:numPr>
+          <w:ilvl w:val="0"/>
+          <w:numId w:val="2"/>
+        </w:numPr>
+        <w:spacing w:after="80"/>
+      </w:pPr>
+      <w:r>
+        <w:t xml:space="preserve">Operación de hoy — agenda del día (primeras 6 citas, con enlace "Ver todo") y un panel de actividad reciente/estaciones/top del mes.</w:t>
       </w:r>
     </w:p>
     <w:p>
@@ -475,7 +541,7 @@
           <w:sz w:val="20"/>
           <w:szCs w:val="20"/>
         </w:rPr>
-        <w:t xml:space="preserve">Asistente de reserva — resumen final y confirmación.</w:t>
+        <w:t xml:space="preserve">Panel principal del administrador completo, de arriba hacia abajo.</w:t>
       </w:r>
     </w:p>
     <w:p>
@@ -483,46 +549,46 @@
         <w:pStyle w:val="Heading2"/>
       </w:pPr>
       <w:r>
-        <w:t xml:space="preserve">2.2 Mis citas</w:t>
-      </w:r>
-    </w:p>
-    <w:p>
-      <w:pPr>
-        <w:pStyle w:val="ListParagraph"/>
-        <w:numPr>
-          <w:ilvl w:val="0"/>
-          <w:numId w:val="3"/>
-        </w:numPr>
-        <w:spacing w:after="80"/>
-      </w:pPr>
-      <w:r>
-        <w:t xml:space="preserve">En Mis citas puedes ver el historial completo y el estado de cada una: pendiente, confirmada, en proceso, completada, cancelada o no asistida.</w:t>
-      </w:r>
-    </w:p>
-    <w:p>
-      <w:pPr>
-        <w:pStyle w:val="ListParagraph"/>
-        <w:numPr>
-          <w:ilvl w:val="0"/>
-          <w:numId w:val="3"/>
-        </w:numPr>
-        <w:spacing w:after="80"/>
-      </w:pPr>
-      <w:r>
-        <w:t xml:space="preserve">Puedes cancelar una cita mientras no haya iniciado el servicio.</w:t>
-      </w:r>
-    </w:p>
-    <w:p>
-      <w:pPr>
-        <w:pStyle w:val="ListParagraph"/>
-        <w:numPr>
-          <w:ilvl w:val="0"/>
-          <w:numId w:val="3"/>
-        </w:numPr>
-        <w:spacing w:after="80"/>
-      </w:pPr>
-      <w:r>
-        <w:t xml:space="preserve">Cuando confirman tu cita, te llega un correo con la opción de agregarla a tu calendario (Google Calendar o archivo .ics).</w:t>
+        <w:t xml:space="preserve">2.2 Gestión de usuarios</w:t>
+      </w:r>
+    </w:p>
+    <w:p>
+      <w:pPr>
+        <w:pStyle w:val="ListParagraph"/>
+        <w:numPr>
+          <w:ilvl w:val="0"/>
+          <w:numId w:val="2"/>
+        </w:numPr>
+        <w:spacing w:after="80"/>
+      </w:pPr>
+      <w:r>
+        <w:t xml:space="preserve">En el menú lateral, entra a Usuarios.</w:t>
+      </w:r>
+    </w:p>
+    <w:p>
+      <w:pPr>
+        <w:pStyle w:val="ListParagraph"/>
+        <w:numPr>
+          <w:ilvl w:val="0"/>
+          <w:numId w:val="2"/>
+        </w:numPr>
+        <w:spacing w:after="80"/>
+      </w:pPr>
+      <w:r>
+        <w:t xml:space="preserve">Ahí ves el listado completo con su rol asignado (administrador/recepción/barbero/cliente).</w:t>
+      </w:r>
+    </w:p>
+    <w:p>
+      <w:pPr>
+        <w:pStyle w:val="ListParagraph"/>
+        <w:numPr>
+          <w:ilvl w:val="0"/>
+          <w:numId w:val="2"/>
+        </w:numPr>
+        <w:spacing w:after="80"/>
+      </w:pPr>
+      <w:r>
+        <w:t xml:space="preserve">Pulsa Nuevo usuario para crear una cuenta de recepción u otro administrador, o edita una existente para cambiar su rol o desactivarla.</w:t>
       </w:r>
     </w:p>
     <w:p>
@@ -575,7 +641,7 @@
           <w:sz w:val="20"/>
           <w:szCs w:val="20"/>
         </w:rPr>
-        <w:t xml:space="preserve">Pantalla "Mis citas" con el listado y sus estados.</w:t>
+        <w:t xml:space="preserve">Listado de usuarios con su rol asignado, y el formulario de creación/edición.</w:t>
       </w:r>
     </w:p>
     <w:p>
@@ -583,33 +649,59 @@
         <w:pStyle w:val="Heading2"/>
       </w:pPr>
       <w:r>
-        <w:t xml:space="preserve">2.3 Tienda</w:t>
-      </w:r>
-    </w:p>
-    <w:p>
-      <w:pPr>
-        <w:pStyle w:val="ListParagraph"/>
-        <w:numPr>
-          <w:ilvl w:val="0"/>
-          <w:numId w:val="3"/>
-        </w:numPr>
-        <w:spacing w:after="80"/>
-      </w:pPr>
-      <w:r>
-        <w:t xml:space="preserve">En Tienda puedes ver el catálogo de productos, agregarlos al carrito y hacer un pedido independiente de cualquier cita.</w:t>
-      </w:r>
-    </w:p>
-    <w:p>
-      <w:pPr>
-        <w:pStyle w:val="ListParagraph"/>
-        <w:numPr>
-          <w:ilvl w:val="0"/>
-          <w:numId w:val="3"/>
-        </w:numPr>
-        <w:spacing w:after="80"/>
-      </w:pPr>
-      <w:r>
-        <w:t xml:space="preserve">En Mis pedidos ves el estado de tus compras (pendiente / entregado / cancelado). Recibes una notificación cuando tu pedido está listo para recoger en recepción.</w:t>
+        <w:t xml:space="preserve">2.3 Gestión de barberos</w:t>
+      </w:r>
+    </w:p>
+    <w:p>
+      <w:pPr>
+        <w:pStyle w:val="ListParagraph"/>
+        <w:numPr>
+          <w:ilvl w:val="0"/>
+          <w:numId w:val="2"/>
+        </w:numPr>
+        <w:spacing w:after="80"/>
+      </w:pPr>
+      <w:r>
+        <w:t xml:space="preserve">Entra a Barberos en el menú.</w:t>
+      </w:r>
+    </w:p>
+    <w:p>
+      <w:pPr>
+        <w:pStyle w:val="ListParagraph"/>
+        <w:numPr>
+          <w:ilvl w:val="0"/>
+          <w:numId w:val="2"/>
+        </w:numPr>
+        <w:spacing w:after="80"/>
+      </w:pPr>
+      <w:r>
+        <w:t xml:space="preserve">Ahí administras el catálogo de barberos: nombre, especialidad, foto, descripción y si está activo.</w:t>
+      </w:r>
+    </w:p>
+    <w:p>
+      <w:pPr>
+        <w:pStyle w:val="ListParagraph"/>
+        <w:numPr>
+          <w:ilvl w:val="0"/>
+          <w:numId w:val="2"/>
+        </w:numPr>
+        <w:spacing w:after="80"/>
+      </w:pPr>
+      <w:r>
+        <w:t xml:space="preserve">Pulsa Desempeño sobre cualquier barbero para ver sus estadísticas (citas, ingresos generados, calificación promedio).</w:t>
+      </w:r>
+    </w:p>
+    <w:p>
+      <w:pPr>
+        <w:pStyle w:val="ListParagraph"/>
+        <w:numPr>
+          <w:ilvl w:val="0"/>
+          <w:numId w:val="2"/>
+        </w:numPr>
+        <w:spacing w:after="80"/>
+      </w:pPr>
+      <w:r>
+        <w:t xml:space="preserve">El horario semanal de cada barbero se edita desde su propia cuenta (ver sección 4.3) o desde aquí si el administrador necesita ajustarlo.</w:t>
       </w:r>
     </w:p>
     <w:p>
@@ -662,7 +754,41 @@
           <w:sz w:val="20"/>
           <w:szCs w:val="20"/>
         </w:rPr>
-        <w:t xml:space="preserve">Catálogo de la tienda y carrito de compras.</w:t>
+        <w:t xml:space="preserve">Listado de barberos y la pantalla de desempeño de uno de ellos.</w:t>
+      </w:r>
+    </w:p>
+    <w:p>
+      <w:pPr>
+        <w:pStyle w:val="Heading2"/>
+      </w:pPr>
+      <w:r>
+        <w:t xml:space="preserve">2.4 Servicios y productos</w:t>
+      </w:r>
+    </w:p>
+    <w:p>
+      <w:pPr>
+        <w:pStyle w:val="ListParagraph"/>
+        <w:numPr>
+          <w:ilvl w:val="0"/>
+          <w:numId w:val="2"/>
+        </w:numPr>
+        <w:spacing w:after="80"/>
+      </w:pPr>
+      <w:r>
+        <w:t xml:space="preserve">Servicios — catálogo de cortes/tratamientos con precio, duración y categoría. Se puede activar/desactivar un servicio sin borrarlo (por ejemplo, si es temporada baja para cierto tratamiento).</w:t>
+      </w:r>
+    </w:p>
+    <w:p>
+      <w:pPr>
+        <w:pStyle w:val="ListParagraph"/>
+        <w:numPr>
+          <w:ilvl w:val="0"/>
+          <w:numId w:val="2"/>
+        </w:numPr>
+        <w:spacing w:after="80"/>
+      </w:pPr>
+      <w:r>
+        <w:t xml:space="preserve">Productos / Inventario — catálogo de productos, separados en "de uso interno" (los que usa el barbero durante el servicio) y "de venta" (los que se ofrecen al cliente). Cada producto tiene un stock mínimo configurable; si el stock baja de ese mínimo, el sistema envía automáticamente una alerta por correo.</w:t>
       </w:r>
     </w:p>
     <w:p>
@@ -715,7 +841,7 @@
           <w:sz w:val="20"/>
           <w:szCs w:val="20"/>
         </w:rPr>
-        <w:t xml:space="preserve">Pantalla "Mis pedidos" con el estado de cada compra.</w:t>
+        <w:t xml:space="preserve">Catálogo de servicios y la pantalla de inventario con las alertas de stock bajo.</w:t>
       </w:r>
     </w:p>
     <w:p>
@@ -723,33 +849,46 @@
         <w:pStyle w:val="Heading2"/>
       </w:pPr>
       <w:r>
-        <w:t xml:space="preserve">2.4 Tarjeta de socio y puntos</w:t>
-      </w:r>
-    </w:p>
-    <w:p>
-      <w:pPr>
-        <w:pStyle w:val="ListParagraph"/>
-        <w:numPr>
-          <w:ilvl w:val="0"/>
-          <w:numId w:val="3"/>
-        </w:numPr>
-        <w:spacing w:after="80"/>
-      </w:pPr>
-      <w:r>
-        <w:t xml:space="preserve">Tu panel principal muestra tu tarjeta de membresía con tu nivel actual (Nuevo, Regular, VIP, Leyenda) y tus puntos de fidelidad, que suman automáticamente cada vez que completas una cita.</w:t>
-      </w:r>
-    </w:p>
-    <w:p>
-      <w:pPr>
-        <w:pStyle w:val="ListParagraph"/>
-        <w:numPr>
-          <w:ilvl w:val="0"/>
-          <w:numId w:val="3"/>
-        </w:numPr>
-        <w:spacing w:after="80"/>
-      </w:pPr>
-      <w:r>
-        <w:t xml:space="preserve">Toca la tarjeta para voltearla y ver tu código QR de identificación, o descárgala en PDF.</w:t>
+        <w:t xml:space="preserve">2.5 Reportes</w:t>
+      </w:r>
+    </w:p>
+    <w:p>
+      <w:pPr>
+        <w:pStyle w:val="ListParagraph"/>
+        <w:numPr>
+          <w:ilvl w:val="0"/>
+          <w:numId w:val="2"/>
+        </w:numPr>
+        <w:spacing w:after="80"/>
+      </w:pPr>
+      <w:r>
+        <w:t xml:space="preserve">Entra a Reportes en el menú.</w:t>
+      </w:r>
+    </w:p>
+    <w:p>
+      <w:pPr>
+        <w:pStyle w:val="ListParagraph"/>
+        <w:numPr>
+          <w:ilvl w:val="0"/>
+          <w:numId w:val="2"/>
+        </w:numPr>
+        <w:spacing w:after="80"/>
+      </w:pPr>
+      <w:r>
+        <w:t xml:space="preserve">Ahí puedes filtrar por rango de fechas, barbero y servicio, y consolidar ingresos por citas y por tienda.</w:t>
+      </w:r>
+    </w:p>
+    <w:p>
+      <w:pPr>
+        <w:pStyle w:val="ListParagraph"/>
+        <w:numPr>
+          <w:ilvl w:val="0"/>
+          <w:numId w:val="2"/>
+        </w:numPr>
+        <w:spacing w:after="80"/>
+      </w:pPr>
+      <w:r>
+        <w:t xml:space="preserve">Pulsa Exportar para descargar el reporte en un archivo (Excel/PDF según el tipo de reporte).</w:t>
       </w:r>
     </w:p>
     <w:p>
@@ -802,7 +941,7 @@
           <w:sz w:val="20"/>
           <w:szCs w:val="20"/>
         </w:rPr>
-        <w:t xml:space="preserve">Tarjeta de membresía (frente con nivel/puntos y reverso con QR).</w:t>
+        <w:t xml:space="preserve">Pantalla de reportes con filtros aplicados.</w:t>
       </w:r>
     </w:p>
     <w:p>
@@ -810,15 +949,59 @@
         <w:pStyle w:val="Heading2"/>
       </w:pPr>
       <w:r>
-        <w:t xml:space="preserve">2.5 Muro de inspiración</w:t>
-      </w:r>
-    </w:p>
-    <w:p>
-      <w:pPr>
-        <w:spacing w:after="160"/>
-      </w:pPr>
-      <w:r>
-        <w:t xml:space="preserve">Explora los trabajos que publican los barberos, deja comentarios y reacciones — útil para elegir estilo y barbero antes de reservar.</w:t>
+        <w:t xml:space="preserve">2.6 Campañas de marketing</w:t>
+      </w:r>
+    </w:p>
+    <w:p>
+      <w:pPr>
+        <w:pStyle w:val="ListParagraph"/>
+        <w:numPr>
+          <w:ilvl w:val="0"/>
+          <w:numId w:val="2"/>
+        </w:numPr>
+        <w:spacing w:after="80"/>
+      </w:pPr>
+      <w:r>
+        <w:t xml:space="preserve">Entra a Campañas en el menú.</w:t>
+      </w:r>
+    </w:p>
+    <w:p>
+      <w:pPr>
+        <w:pStyle w:val="ListParagraph"/>
+        <w:numPr>
+          <w:ilvl w:val="0"/>
+          <w:numId w:val="2"/>
+        </w:numPr>
+        <w:spacing w:after="80"/>
+      </w:pPr>
+      <w:r>
+        <w:t xml:space="preserve">Pulsa Nueva campaña, redacta el mensaje y elige a quién va dirigida: todos los clientes, o solo un nivel de lealtad específico (por ejemplo, solo clientes VIP).</w:t>
+      </w:r>
+    </w:p>
+    <w:p>
+      <w:pPr>
+        <w:pStyle w:val="ListParagraph"/>
+        <w:numPr>
+          <w:ilvl w:val="0"/>
+          <w:numId w:val="2"/>
+        </w:numPr>
+        <w:spacing w:after="80"/>
+      </w:pPr>
+      <w:r>
+        <w:t xml:space="preserve">Elige Enviar ahora o Programar para una fecha/hora futura.</w:t>
+      </w:r>
+    </w:p>
+    <w:p>
+      <w:pPr>
+        <w:pStyle w:val="ListParagraph"/>
+        <w:numPr>
+          <w:ilvl w:val="0"/>
+          <w:numId w:val="2"/>
+        </w:numPr>
+        <w:spacing w:after="80"/>
+      </w:pPr>
+      <w:r>
+        <w:t xml:space="preserve">Una vez enviada, la campaña muestra sus métricas de apertura y clics en la misma pantalla — te dice cuántos destinatarios realmente abrieron el correo y cuántos pulsaron el botón.</w:t>
       </w:r>
     </w:p>
     <w:p>
@@ -871,20 +1054,7 @@
           <w:sz w:val="20"/>
           <w:szCs w:val="20"/>
         </w:rPr>
-        <w:t xml:space="preserve">Muro de inspiración con publicaciones de barberos.</w:t>
-      </w:r>
-    </w:p>
-    <w:p>
-      <w:r>
-        <w:br w:type="page"/>
-      </w:r>
-    </w:p>
-    <w:p>
-      <w:pPr>
-        <w:pStyle w:val="Heading1"/>
-      </w:pPr>
-      <w:r>
-        <w:t xml:space="preserve">3. Rol: Barbero</w:t>
+        <w:t xml:space="preserve">Formulario de creación de campaña, y la pantalla de métricas de una campaña ya enviada.</w:t>
       </w:r>
     </w:p>
     <w:p>
@@ -892,46 +1062,46 @@
         <w:pStyle w:val="Heading2"/>
       </w:pPr>
       <w:r>
-        <w:t xml:space="preserve">3.1 Mi agenda</w:t>
-      </w:r>
-    </w:p>
-    <w:p>
-      <w:pPr>
-        <w:pStyle w:val="ListParagraph"/>
-        <w:numPr>
-          <w:ilvl w:val="0"/>
-          <w:numId w:val="3"/>
-        </w:numPr>
-        <w:spacing w:after="80"/>
-      </w:pPr>
-      <w:r>
-        <w:t xml:space="preserve">Tu panel muestra las citas del día con vista de línea de tiempo.</w:t>
-      </w:r>
-    </w:p>
-    <w:p>
-      <w:pPr>
-        <w:pStyle w:val="ListParagraph"/>
-        <w:numPr>
-          <w:ilvl w:val="0"/>
-          <w:numId w:val="3"/>
-        </w:numPr>
-        <w:spacing w:after="80"/>
-      </w:pPr>
-      <w:r>
-        <w:t xml:space="preserve">Las citas nuevas llegan en estado pendiente: debes aprobar o rechazar cada una desde tu agenda antes de que se puedan cobrar o atender.</w:t>
-      </w:r>
-    </w:p>
-    <w:p>
-      <w:pPr>
-        <w:pStyle w:val="ListParagraph"/>
-        <w:numPr>
-          <w:ilvl w:val="0"/>
-          <w:numId w:val="3"/>
-        </w:numPr>
-        <w:spacing w:after="80"/>
-      </w:pPr>
-      <w:r>
-        <w:t xml:space="preserve">Un botón de acción rápida en cada cita te lleva directo al siguiente paso según su estado (aprobar, iniciar servicio, marcar como completada).</w:t>
+        <w:t xml:space="preserve">2.7 Configuración del negocio</w:t>
+      </w:r>
+    </w:p>
+    <w:p>
+      <w:pPr>
+        <w:pStyle w:val="ListParagraph"/>
+        <w:numPr>
+          <w:ilvl w:val="0"/>
+          <w:numId w:val="2"/>
+        </w:numPr>
+        <w:spacing w:after="80"/>
+      </w:pPr>
+      <w:r>
+        <w:t xml:space="preserve">Entra a Configuración en el menú.</w:t>
+      </w:r>
+    </w:p>
+    <w:p>
+      <w:pPr>
+        <w:pStyle w:val="ListParagraph"/>
+        <w:numPr>
+          <w:ilvl w:val="0"/>
+          <w:numId w:val="2"/>
+        </w:numPr>
+        <w:spacing w:after="80"/>
+      </w:pPr>
+      <w:r>
+        <w:t xml:space="preserve">Ahí ajustas: horario de apertura/cierre, política de cancelación (horas de anticipación requeridas), datos de contacto y redes sociales, y datos bancarios.</w:t>
+      </w:r>
+    </w:p>
+    <w:p>
+      <w:pPr>
+        <w:pStyle w:val="ListParagraph"/>
+        <w:numPr>
+          <w:ilvl w:val="0"/>
+          <w:numId w:val="2"/>
+        </w:numPr>
+        <w:spacing w:after="80"/>
+      </w:pPr>
+      <w:r>
+        <w:t xml:space="preserve">El interruptor de Modo mantenimiento bloquea el acceso al sitio para todos los roles excepto administradores — útil mientras se hace una actualización del sistema.</w:t>
       </w:r>
     </w:p>
     <w:p>
@@ -984,7 +1154,23 @@
           <w:sz w:val="20"/>
           <w:szCs w:val="20"/>
         </w:rPr>
-        <w:t xml:space="preserve">Agenda del barbero — vista de línea de tiempo del día.</w:t>
+        <w:t xml:space="preserve">Pantalla de configuración del negocio.</w:t>
+      </w:r>
+    </w:p>
+    <w:p>
+      <w:pPr>
+        <w:pStyle w:val="Heading2"/>
+      </w:pPr>
+      <w:r>
+        <w:t xml:space="preserve">2.8 Bitácora de auditoría</w:t>
+      </w:r>
+    </w:p>
+    <w:p>
+      <w:pPr>
+        <w:spacing w:after="160"/>
+      </w:pPr>
+      <w:r>
+        <w:t xml:space="preserve">En Bitácora puedes ver un registro cronológico de las acciones importantes del sistema (creación/edición de citas, pagos, movimientos de inventario, cambios de usuarios) — útil para investigar cualquier discrepancia.</w:t>
       </w:r>
     </w:p>
     <w:p>
@@ -1037,7 +1223,7 @@
           <w:sz w:val="20"/>
           <w:szCs w:val="20"/>
         </w:rPr>
-        <w:t xml:space="preserve">Tarjeta de cita pendiente con los botones Aprobar / Rechazar.</w:t>
+        <w:t xml:space="preserve">Pantalla de bitácora de auditoría.</w:t>
       </w:r>
     </w:p>
     <w:p>
@@ -1045,7 +1231,7 @@
         <w:pStyle w:val="Heading2"/>
       </w:pPr>
       <w:r>
-        <w:t xml:space="preserve">3.2 Historial y propinas</w:t>
+        <w:t xml:space="preserve">2.9 Respaldo de base de datos</w:t>
       </w:r>
     </w:p>
     <w:p>
@@ -1053,23 +1239,7 @@
         <w:spacing w:after="160"/>
       </w:pPr>
       <w:r>
-        <w:t xml:space="preserve">Puedes ver tu historial de citas completadas y el total de propinas recibidas en tu panel principal.</w:t>
-      </w:r>
-    </w:p>
-    <w:p>
-      <w:pPr>
-        <w:pStyle w:val="Heading2"/>
-      </w:pPr>
-      <w:r>
-        <w:t xml:space="preserve">3.3 Publicar en el muro</w:t>
-      </w:r>
-    </w:p>
-    <w:p>
-      <w:pPr>
-        <w:spacing w:after="160"/>
-      </w:pPr>
-      <w:r>
-        <w:t xml:space="preserve">Desde tu perfil puedes subir fotos de tus trabajos al muro de inspiración, para que los clientes los vean, comenten y reaccionen — es tu portafolio dentro de la app.</w:t>
+        <w:t xml:space="preserve">Desde el botón Backup del panel principal puedes descargar una copia de seguridad completa de la base de datos en cualquier momento.</w:t>
       </w:r>
     </w:p>
     <w:p>
@@ -1122,20 +1292,7 @@
           <w:sz w:val="20"/>
           <w:szCs w:val="20"/>
         </w:rPr>
-        <w:t xml:space="preserve">Formulario para publicar un nuevo trabajo en el muro.</w:t>
-      </w:r>
-    </w:p>
-    <w:p>
-      <w:r>
-        <w:br w:type="page"/>
-      </w:r>
-    </w:p>
-    <w:p>
-      <w:pPr>
-        <w:pStyle w:val="Heading1"/>
-      </w:pPr>
-      <w:r>
-        <w:t xml:space="preserve">4. Rol: Recepción</w:t>
+        <w:t xml:space="preserve">Botón de backup y la descarga generada.</w:t>
       </w:r>
     </w:p>
     <w:p>
@@ -1143,7 +1300,15 @@
         <w:pStyle w:val="Heading2"/>
       </w:pPr>
       <w:r>
-        <w:t xml:space="preserve">4.1 Gestión de citas</w:t>
+        <w:t xml:space="preserve">2.10 Analítica avanzada (módulo Spark)</w:t>
+      </w:r>
+    </w:p>
+    <w:p>
+      <w:pPr>
+        <w:spacing w:after="160"/>
+      </w:pPr>
+      <w:r>
+        <w:t xml:space="preserve">Además del resumen del día a día, la barbería cuenta con un dashboard de analítica aparte (construido con el módulo académico de Big Data), pensado para decisiones de negocio de más largo plazo. Se accede por separado (lo administra el equipo técnico) y ofrece:</w:t>
       </w:r>
     </w:p>
     <w:p>
@@ -1156,7 +1321,7 @@
         <w:spacing w:after="80"/>
       </w:pPr>
       <w:r>
-        <w:t xml:space="preserve">Ves todas las citas del día de todos los barberos, con su estado.</w:t>
+        <w:t xml:space="preserve">Predicción de demanda — qué horarios y días tienen más movimiento, para planear turnos de personal.</w:t>
       </w:r>
     </w:p>
     <w:p>
@@ -1169,7 +1334,93 @@
         <w:spacing w:after="80"/>
       </w:pPr>
       <w:r>
-        <w:t xml:space="preserve">Puedes registrar una cita rápida de walk-in (cliente sin cita previa que llega directo al local).</w:t>
+        <w:t xml:space="preserve">Fidelización — cómo se distribuyen los puntos y niveles de los clientes.</w:t>
+      </w:r>
+    </w:p>
+    <w:p>
+      <w:pPr>
+        <w:pStyle w:val="ListParagraph"/>
+        <w:numPr>
+          <w:ilvl w:val="0"/>
+          <w:numId w:val="3"/>
+        </w:numPr>
+        <w:spacing w:after="80"/>
+      </w:pPr>
+      <w:r>
+        <w:t xml:space="preserve">Utilización de barberos — quién tiene agenda saturada y quién tiene disponibilidad.</w:t>
+      </w:r>
+    </w:p>
+    <w:p>
+      <w:pPr>
+        <w:pStyle w:val="ListParagraph"/>
+        <w:numPr>
+          <w:ilvl w:val="0"/>
+          <w:numId w:val="3"/>
+        </w:numPr>
+        <w:spacing w:after="80"/>
+      </w:pPr>
+      <w:r>
+        <w:t xml:space="preserve">Inventario — márgenes de los productos de venta y alertas de reorden.</w:t>
+      </w:r>
+    </w:p>
+    <w:p>
+      <w:pPr>
+        <w:pStyle w:val="ListParagraph"/>
+        <w:numPr>
+          <w:ilvl w:val="0"/>
+          <w:numId w:val="3"/>
+        </w:numPr>
+        <w:spacing w:after="80"/>
+      </w:pPr>
+      <w:r>
+        <w:t xml:space="preserve">Tienda y pedidos — qué tan bien convierten los add-ons de producto dentro de una cita frente a la tienda suelta.</w:t>
+      </w:r>
+    </w:p>
+    <w:p>
+      <w:pPr>
+        <w:pStyle w:val="ListParagraph"/>
+        <w:numPr>
+          <w:ilvl w:val="0"/>
+          <w:numId w:val="3"/>
+        </w:numPr>
+        <w:spacing w:after="80"/>
+      </w:pPr>
+      <w:r>
+        <w:t xml:space="preserve">Muro social — qué barberos generan más interacción con sus publicaciones.</w:t>
+      </w:r>
+    </w:p>
+    <w:p>
+      <w:pPr>
+        <w:pStyle w:val="ListParagraph"/>
+        <w:numPr>
+          <w:ilvl w:val="0"/>
+          <w:numId w:val="3"/>
+        </w:numPr>
+        <w:spacing w:after="80"/>
+      </w:pPr>
+      <w:r>
+        <w:t xml:space="preserve">Segmentación de clientes y recomendación de servicios.</w:t>
+      </w:r>
+    </w:p>
+    <w:p>
+      <w:pPr>
+        <w:pBdr>
+          <w:left w:val="single" w:color="B8860B" w:sz="24" w:space="8"/>
+        </w:pBdr>
+        <w:shd w:fill="F2F2F2" w:val="clear"/>
+        <w:spacing w:after="200" w:before="160"/>
+        <w:ind w:left="120"/>
+      </w:pPr>
+      <w:r>
+        <w:rPr>
+          <w:b/>
+          <w:bCs/>
+          <w:color w:val="B8860B"/>
+        </w:rPr>
+        <w:t xml:space="preserve">Nota:  </w:t>
+      </w:r>
+      <w:r>
+        <w:t xml:space="preserve"> este panel es de solo lectura sobre los mismos datos de la app — no se edita nada desde ahí, solo se consulta para tomar decisiones.</w:t>
       </w:r>
     </w:p>
     <w:p>
@@ -1222,7 +1473,44 @@
           <w:sz w:val="20"/>
           <w:szCs w:val="20"/>
         </w:rPr>
-        <w:t xml:space="preserve">Vista general de citas del día (todos los barberos).</w:t>
+        <w:t xml:space="preserve">Dashboard de analítica avanzada (Spark) — vista general y alguna pestaña específica.</w:t>
+      </w:r>
+    </w:p>
+    <w:p>
+      <w:r>
+        <w:br w:type="page"/>
+      </w:r>
+    </w:p>
+    <w:p>
+      <w:pPr>
+        <w:pStyle w:val="Heading1"/>
+      </w:pPr>
+      <w:r>
+        <w:t xml:space="preserve">3. Rol: Recepción</w:t>
+      </w:r>
+    </w:p>
+    <w:p>
+      <w:pPr>
+        <w:spacing w:after="160"/>
+      </w:pPr>
+      <w:r>
+        <w:t xml:space="preserve">La recepcionista gestiona la operación diaria: citas de todos los barberos, cobros, clientes y la bandeja de pedidos de tienda.</w:t>
+      </w:r>
+    </w:p>
+    <w:p>
+      <w:pPr>
+        <w:pStyle w:val="Heading2"/>
+      </w:pPr>
+      <w:r>
+        <w:t xml:space="preserve">3.1 Panel principal</w:t>
+      </w:r>
+    </w:p>
+    <w:p>
+      <w:pPr>
+        <w:spacing w:after="160"/>
+      </w:pPr>
+      <w:r>
+        <w:t xml:space="preserve">Al entrar ves de un vistazo: pedidos pendientes por entregar, total cobrado en el día, y accesos directos a Nueva cita, Nuevo cliente, Cobrar y Reportes.</w:t>
       </w:r>
     </w:p>
     <w:p>
@@ -1275,7 +1563,7 @@
           <w:sz w:val="20"/>
           <w:szCs w:val="20"/>
         </w:rPr>
-        <w:t xml:space="preserve">Formulario de registro rápido de walk-in.</w:t>
+        <w:t xml:space="preserve">Panel principal de recepción.</w:t>
       </w:r>
     </w:p>
     <w:p>
@@ -1283,54 +1571,46 @@
         <w:pStyle w:val="Heading2"/>
       </w:pPr>
       <w:r>
-        <w:t xml:space="preserve">4.2 Cobro</w:t>
-      </w:r>
-    </w:p>
-    <w:p>
-      <w:pPr>
-        <w:pBdr>
-          <w:left w:val="single" w:color="B8860B" w:sz="24" w:space="8"/>
-        </w:pBdr>
-        <w:shd w:fill="F2F2F2" w:val="clear"/>
-        <w:spacing w:after="200" w:before="160"/>
-        <w:ind w:left="120"/>
-      </w:pPr>
-      <w:r>
-        <w:rPr>
-          <w:b/>
-          <w:bCs/>
-          <w:color w:val="B8860B"/>
-        </w:rPr>
-        <w:t xml:space="preserve">Importante:  </w:t>
-      </w:r>
-      <w:r>
-        <w:t xml:space="preserve"> el cobro solo está disponible para citas ya aprobadas (confirmada, en proceso o completada) — nunca para una cita pendiente sin revisar por el barbero.</w:t>
-      </w:r>
-    </w:p>
-    <w:p>
-      <w:pPr>
-        <w:pStyle w:val="ListParagraph"/>
-        <w:numPr>
-          <w:ilvl w:val="0"/>
-          <w:numId w:val="3"/>
-        </w:numPr>
-        <w:spacing w:after="80"/>
-      </w:pPr>
-      <w:r>
-        <w:t xml:space="preserve">Al completar el servicio puedes cobrar en un solo paso: se registra el pago, la propina y automáticamente se generan los puntos de lealtad del cliente.</w:t>
-      </w:r>
-    </w:p>
-    <w:p>
-      <w:pPr>
-        <w:pStyle w:val="ListParagraph"/>
-        <w:numPr>
-          <w:ilvl w:val="0"/>
-          <w:numId w:val="3"/>
-        </w:numPr>
-        <w:spacing w:after="80"/>
-      </w:pPr>
-      <w:r>
-        <w:t xml:space="preserve">Se genera un recibo/factura en PDF que puedes reenviar o imprimir.</w:t>
+        <w:t xml:space="preserve">3.2 Gestión de citas del día</w:t>
+      </w:r>
+    </w:p>
+    <w:p>
+      <w:pPr>
+        <w:pStyle w:val="ListParagraph"/>
+        <w:numPr>
+          <w:ilvl w:val="0"/>
+          <w:numId w:val="2"/>
+        </w:numPr>
+        <w:spacing w:after="80"/>
+      </w:pPr>
+      <w:r>
+        <w:t xml:space="preserve">Entra a Citas en el menú para ver todas las citas de todos los barberos, con su estado (pendiente, confirmada, en proceso, completada, cancelada, no asistió).</w:t>
+      </w:r>
+    </w:p>
+    <w:p>
+      <w:pPr>
+        <w:pStyle w:val="ListParagraph"/>
+        <w:numPr>
+          <w:ilvl w:val="0"/>
+          <w:numId w:val="2"/>
+        </w:numPr>
+        <w:spacing w:after="80"/>
+      </w:pPr>
+      <w:r>
+        <w:t xml:space="preserve">También puedes usar el Calendario para una vista tipo agenda semanal/mensual.</w:t>
+      </w:r>
+    </w:p>
+    <w:p>
+      <w:pPr>
+        <w:pStyle w:val="ListParagraph"/>
+        <w:numPr>
+          <w:ilvl w:val="0"/>
+          <w:numId w:val="2"/>
+        </w:numPr>
+        <w:spacing w:after="80"/>
+      </w:pPr>
+      <w:r>
+        <w:t xml:space="preserve">Solo puedes cobrar citas que ya estén aprobadas por el barbero (confirmada, en proceso o completada) — una cita pendiente sin revisar por el barbero no se puede cobrar todavía.</w:t>
       </w:r>
     </w:p>
     <w:p>
@@ -1383,7 +1663,7 @@
           <w:sz w:val="20"/>
           <w:szCs w:val="20"/>
         </w:rPr>
-        <w:t xml:space="preserve">Pantalla de cobro en un paso (monto, propina, método de pago).</w:t>
+        <w:t xml:space="preserve">Vista de citas del día y el calendario semanal.</w:t>
       </w:r>
     </w:p>
     <w:p>
@@ -1391,33 +1671,46 @@
         <w:pStyle w:val="Heading2"/>
       </w:pPr>
       <w:r>
-        <w:t xml:space="preserve">4.3 Bandeja de pedidos</w:t>
-      </w:r>
-    </w:p>
-    <w:p>
-      <w:pPr>
-        <w:pStyle w:val="ListParagraph"/>
-        <w:numPr>
-          <w:ilvl w:val="0"/>
-          <w:numId w:val="3"/>
-        </w:numPr>
-        <w:spacing w:after="80"/>
-      </w:pPr>
-      <w:r>
-        <w:t xml:space="preserve">Todos los pedidos de tienda (y los add-ons de producto agregados dentro de una reserva) llegan a tu bandeja de pedidos.</w:t>
-      </w:r>
-    </w:p>
-    <w:p>
-      <w:pPr>
-        <w:pStyle w:val="ListParagraph"/>
-        <w:numPr>
-          <w:ilvl w:val="0"/>
-          <w:numId w:val="3"/>
-        </w:numPr>
-        <w:spacing w:after="80"/>
-      </w:pPr>
-      <w:r>
-        <w:t xml:space="preserve">Al marcar un pedido como entregado, el cliente recibe una notificación automática y se genera su recibo.</w:t>
+        <w:t xml:space="preserve">3.3 Registrar un walk-in (cliente sin cita previa)</w:t>
+      </w:r>
+    </w:p>
+    <w:p>
+      <w:pPr>
+        <w:pStyle w:val="ListParagraph"/>
+        <w:numPr>
+          <w:ilvl w:val="0"/>
+          <w:numId w:val="2"/>
+        </w:numPr>
+        <w:spacing w:after="80"/>
+      </w:pPr>
+      <w:r>
+        <w:t xml:space="preserve">Pulsa Nueva cita o el botón de walk-in.</w:t>
+      </w:r>
+    </w:p>
+    <w:p>
+      <w:pPr>
+        <w:pStyle w:val="ListParagraph"/>
+        <w:numPr>
+          <w:ilvl w:val="0"/>
+          <w:numId w:val="2"/>
+        </w:numPr>
+        <w:spacing w:after="80"/>
+      </w:pPr>
+      <w:r>
+        <w:t xml:space="preserve">Busca al cliente por nombre (autocompletado) o regístralo si es nuevo.</w:t>
+      </w:r>
+    </w:p>
+    <w:p>
+      <w:pPr>
+        <w:pStyle w:val="ListParagraph"/>
+        <w:numPr>
+          <w:ilvl w:val="0"/>
+          <w:numId w:val="2"/>
+        </w:numPr>
+        <w:spacing w:after="80"/>
+      </w:pPr>
+      <w:r>
+        <w:t xml:space="preserve">Elige barbero, servicio y horario disponible, y confirma.</w:t>
       </w:r>
     </w:p>
     <w:p>
@@ -1470,7 +1763,7 @@
           <w:sz w:val="20"/>
           <w:szCs w:val="20"/>
         </w:rPr>
-        <w:t xml:space="preserve">Bandeja de pedidos por entregar.</w:t>
+        <w:t xml:space="preserve">Formulario de registro rápido de walk-in.</w:t>
       </w:r>
     </w:p>
     <w:p>
@@ -1478,15 +1771,46 @@
         <w:pStyle w:val="Heading2"/>
       </w:pPr>
       <w:r>
-        <w:t xml:space="preserve">4.4 Panel de resumen</w:t>
-      </w:r>
-    </w:p>
-    <w:p>
-      <w:pPr>
-        <w:spacing w:after="160"/>
-      </w:pPr>
-      <w:r>
-        <w:t xml:space="preserve">Tu panel principal muestra de un vistazo: pedidos pendientes por entregar, total cobrado en el día, y acceso directo al registro de walk-in.</w:t>
+        <w:t xml:space="preserve">3.4 Cobrar una cita</w:t>
+      </w:r>
+    </w:p>
+    <w:p>
+      <w:pPr>
+        <w:pStyle w:val="ListParagraph"/>
+        <w:numPr>
+          <w:ilvl w:val="0"/>
+          <w:numId w:val="2"/>
+        </w:numPr>
+        <w:spacing w:after="80"/>
+      </w:pPr>
+      <w:r>
+        <w:t xml:space="preserve">Desde la cita ya aprobada, pulsa Cobrar.</w:t>
+      </w:r>
+    </w:p>
+    <w:p>
+      <w:pPr>
+        <w:pStyle w:val="ListParagraph"/>
+        <w:numPr>
+          <w:ilvl w:val="0"/>
+          <w:numId w:val="2"/>
+        </w:numPr>
+        <w:spacing w:after="80"/>
+      </w:pPr>
+      <w:r>
+        <w:t xml:space="preserve">Registra el monto, el método de pago y la propina en un solo paso.</w:t>
+      </w:r>
+    </w:p>
+    <w:p>
+      <w:pPr>
+        <w:pStyle w:val="ListParagraph"/>
+        <w:numPr>
+          <w:ilvl w:val="0"/>
+          <w:numId w:val="2"/>
+        </w:numPr>
+        <w:spacing w:after="80"/>
+      </w:pPr>
+      <w:r>
+        <w:t xml:space="preserve">Al confirmar, el sistema genera automáticamente el recibo/factura en PDF, otorga los puntos de lealtad al cliente, y envía la notificación de recibo por correo.</w:t>
       </w:r>
     </w:p>
     <w:p>
@@ -1539,20 +1863,7 @@
           <w:sz w:val="20"/>
           <w:szCs w:val="20"/>
         </w:rPr>
-        <w:t xml:space="preserve">Panel principal de recepción con el resumen del día.</w:t>
-      </w:r>
-    </w:p>
-    <w:p>
-      <w:r>
-        <w:br w:type="page"/>
-      </w:r>
-    </w:p>
-    <w:p>
-      <w:pPr>
-        <w:pStyle w:val="Heading1"/>
-      </w:pPr>
-      <w:r>
-        <w:t xml:space="preserve">5. Rol: Administrador</w:t>
+        <w:t xml:space="preserve">Pantalla de cobro en un paso (monto, propina, método de pago).</w:t>
       </w:r>
     </w:p>
     <w:p>
@@ -1560,54 +1871,46 @@
         <w:pStyle w:val="Heading2"/>
       </w:pPr>
       <w:r>
-        <w:t xml:space="preserve">5.1 Panel principal</w:t>
-      </w:r>
-    </w:p>
-    <w:p>
-      <w:pPr>
-        <w:spacing w:after="160"/>
-      </w:pPr>
-      <w:r>
-        <w:t xml:space="preserve">El panel del administrador está organizado en tres zonas:</w:t>
-      </w:r>
-    </w:p>
-    <w:p>
-      <w:pPr>
-        <w:pStyle w:val="ListParagraph"/>
-        <w:numPr>
-          <w:ilvl w:val="0"/>
-          <w:numId w:val="2"/>
-        </w:numPr>
-        <w:spacing w:after="80"/>
-      </w:pPr>
-      <w:r>
-        <w:t xml:space="preserve">Resumen del negocio — KPIs del día/mes: citas, ingresos, pedidos.</w:t>
-      </w:r>
-    </w:p>
-    <w:p>
-      <w:pPr>
-        <w:pStyle w:val="ListParagraph"/>
-        <w:numPr>
-          <w:ilvl w:val="0"/>
-          <w:numId w:val="2"/>
-        </w:numPr>
-        <w:spacing w:after="80"/>
-      </w:pPr>
-      <w:r>
-        <w:t xml:space="preserve">Gestión — accesos directos a usuarios, barberos, servicios, productos, configuración del negocio.</w:t>
-      </w:r>
-    </w:p>
-    <w:p>
-      <w:pPr>
-        <w:pStyle w:val="ListParagraph"/>
-        <w:numPr>
-          <w:ilvl w:val="0"/>
-          <w:numId w:val="2"/>
-        </w:numPr>
-        <w:spacing w:after="80"/>
-      </w:pPr>
-      <w:r>
-        <w:t xml:space="preserve">Analítica avanzada (sección plegable) — un widget con los insights generados por el módulo de Spark, directamente en el dashboard de la app.</w:t>
+        <w:t xml:space="preserve">3.5 Bandeja de pedidos de tienda</w:t>
+      </w:r>
+    </w:p>
+    <w:p>
+      <w:pPr>
+        <w:pStyle w:val="ListParagraph"/>
+        <w:numPr>
+          <w:ilvl w:val="0"/>
+          <w:numId w:val="2"/>
+        </w:numPr>
+        <w:spacing w:after="80"/>
+      </w:pPr>
+      <w:r>
+        <w:t xml:space="preserve">Entra a Pedidos en el menú.</w:t>
+      </w:r>
+    </w:p>
+    <w:p>
+      <w:pPr>
+        <w:pStyle w:val="ListParagraph"/>
+        <w:numPr>
+          <w:ilvl w:val="0"/>
+          <w:numId w:val="2"/>
+        </w:numPr>
+        <w:spacing w:after="80"/>
+      </w:pPr>
+      <w:r>
+        <w:t xml:space="preserve">Ahí ves todos los pedidos de tienda pendientes (y los add-ons de producto agregados dentro de una reserva).</w:t>
+      </w:r>
+    </w:p>
+    <w:p>
+      <w:pPr>
+        <w:pStyle w:val="ListParagraph"/>
+        <w:numPr>
+          <w:ilvl w:val="0"/>
+          <w:numId w:val="2"/>
+        </w:numPr>
+        <w:spacing w:after="80"/>
+      </w:pPr>
+      <w:r>
+        <w:t xml:space="preserve">Al marcar un pedido como Entregado, el cliente recibe automáticamente una notificación y se genera su recibo.</w:t>
       </w:r>
     </w:p>
     <w:p>
@@ -1660,7 +1963,7 @@
           <w:sz w:val="20"/>
           <w:szCs w:val="20"/>
         </w:rPr>
-        <w:t xml:space="preserve">Panel principal del administrador — las tres zonas.</w:t>
+        <w:t xml:space="preserve">Bandeja de pedidos por entregar.</w:t>
       </w:r>
     </w:p>
     <w:p>
@@ -1668,33 +1971,33 @@
         <w:pStyle w:val="Heading2"/>
       </w:pPr>
       <w:r>
-        <w:t xml:space="preserve">5.2 Gestión de usuarios y roles</w:t>
-      </w:r>
-    </w:p>
-    <w:p>
-      <w:pPr>
-        <w:pStyle w:val="ListParagraph"/>
-        <w:numPr>
-          <w:ilvl w:val="0"/>
-          <w:numId w:val="3"/>
-        </w:numPr>
-        <w:spacing w:after="80"/>
-      </w:pPr>
-      <w:r>
-        <w:t xml:space="preserve">Desde Usuarios puedes crear/editar cuentas de recepción y barberos, y asignarles su rol.</w:t>
-      </w:r>
-    </w:p>
-    <w:p>
-      <w:pPr>
-        <w:pStyle w:val="ListParagraph"/>
-        <w:numPr>
-          <w:ilvl w:val="0"/>
-          <w:numId w:val="3"/>
-        </w:numPr>
-        <w:spacing w:after="80"/>
-      </w:pPr>
-      <w:r>
-        <w:t xml:space="preserve">Desde Barberos administras el catálogo de barberos, su especialidad y su horario semanal.</w:t>
+        <w:t xml:space="preserve">3.6 Gestión de clientes</w:t>
+      </w:r>
+    </w:p>
+    <w:p>
+      <w:pPr>
+        <w:pStyle w:val="ListParagraph"/>
+        <w:numPr>
+          <w:ilvl w:val="0"/>
+          <w:numId w:val="2"/>
+        </w:numPr>
+        <w:spacing w:after="80"/>
+      </w:pPr>
+      <w:r>
+        <w:t xml:space="preserve">Entra a Clientes en el menú.</w:t>
+      </w:r>
+    </w:p>
+    <w:p>
+      <w:pPr>
+        <w:pStyle w:val="ListParagraph"/>
+        <w:numPr>
+          <w:ilvl w:val="0"/>
+          <w:numId w:val="2"/>
+        </w:numPr>
+        <w:spacing w:after="80"/>
+      </w:pPr>
+      <w:r>
+        <w:t xml:space="preserve">Puedes ver el historial de cada cliente, editar sus datos de contacto, o darlo de alta manualmente.</w:t>
       </w:r>
     </w:p>
     <w:p>
@@ -1747,7 +2050,7 @@
           <w:sz w:val="20"/>
           <w:szCs w:val="20"/>
         </w:rPr>
-        <w:t xml:space="preserve">Listado de usuarios con su rol asignado.</w:t>
+        <w:t xml:space="preserve">Listado de clientes con acceso al historial de uno de ellos.</w:t>
       </w:r>
     </w:p>
     <w:p>
@@ -1755,33 +2058,15 @@
         <w:pStyle w:val="Heading2"/>
       </w:pPr>
       <w:r>
-        <w:t xml:space="preserve">5.3 Servicios, productos e inventario</w:t>
-      </w:r>
-    </w:p>
-    <w:p>
-      <w:pPr>
-        <w:pStyle w:val="ListParagraph"/>
-        <w:numPr>
-          <w:ilvl w:val="0"/>
-          <w:numId w:val="3"/>
-        </w:numPr>
-        <w:spacing w:after="80"/>
-      </w:pPr>
-      <w:r>
-        <w:t xml:space="preserve">Servicios: catálogo de cortes/tratamientos con precio y duración.</w:t>
-      </w:r>
-    </w:p>
-    <w:p>
-      <w:pPr>
-        <w:pStyle w:val="ListParagraph"/>
-        <w:numPr>
-          <w:ilvl w:val="0"/>
-          <w:numId w:val="3"/>
-        </w:numPr>
-        <w:spacing w:after="80"/>
-      </w:pPr>
-      <w:r>
-        <w:t xml:space="preserve">Inventario: catálogo de productos (de venta al cliente o de uso interno del barbero), con alertas cuando el stock baja del mínimo configurado — recibirás una notificación automática si algún producto necesita reorden.</w:t>
+        <w:t xml:space="preserve">3.7 Inventario (consulta y ajuste)</w:t>
+      </w:r>
+    </w:p>
+    <w:p>
+      <w:pPr>
+        <w:spacing w:after="160"/>
+      </w:pPr>
+      <w:r>
+        <w:t xml:space="preserve">Recepción puede ver el inventario y registrar movimientos de stock (entradas/salidas), pero la creación de nuevos productos está reservada al administrador.</w:t>
       </w:r>
     </w:p>
     <w:p>
@@ -1834,7 +2119,28 @@
           <w:sz w:val="20"/>
           <w:szCs w:val="20"/>
         </w:rPr>
-        <w:t xml:space="preserve">Pantalla de inventario con alertas de reorden.</w:t>
+        <w:t xml:space="preserve">Pantalla de movimientos de inventario.</w:t>
+      </w:r>
+    </w:p>
+    <w:p>
+      <w:r>
+        <w:br w:type="page"/>
+      </w:r>
+    </w:p>
+    <w:p>
+      <w:pPr>
+        <w:pStyle w:val="Heading1"/>
+      </w:pPr>
+      <w:r>
+        <w:t xml:space="preserve">4. Rol: Barbero</w:t>
+      </w:r>
+    </w:p>
+    <w:p>
+      <w:pPr>
+        <w:spacing w:after="160"/>
+      </w:pPr>
+      <w:r>
+        <w:t xml:space="preserve">El barbero gestiona su propia agenda, aprueba o rechaza sus citas, y mantiene su perfil y portafolio público.</w:t>
       </w:r>
     </w:p>
     <w:p>
@@ -1842,15 +2148,46 @@
         <w:pStyle w:val="Heading2"/>
       </w:pPr>
       <w:r>
-        <w:t xml:space="preserve">5.4 Reportes e ingresos</w:t>
-      </w:r>
-    </w:p>
-    <w:p>
-      <w:pPr>
-        <w:spacing w:after="160"/>
-      </w:pPr>
-      <w:r>
-        <w:t xml:space="preserve">La sección de Reportes consolida los ingresos por citas y por tienda, con filtros por fecha, barbero y servicio.</w:t>
+        <w:t xml:space="preserve">4.1 Mi agenda</w:t>
+      </w:r>
+    </w:p>
+    <w:p>
+      <w:pPr>
+        <w:pStyle w:val="ListParagraph"/>
+        <w:numPr>
+          <w:ilvl w:val="0"/>
+          <w:numId w:val="2"/>
+        </w:numPr>
+        <w:spacing w:after="80"/>
+      </w:pPr>
+      <w:r>
+        <w:t xml:space="preserve">Al entrar, ves las citas del día en una vista de línea de tiempo (timeline).</w:t>
+      </w:r>
+    </w:p>
+    <w:p>
+      <w:pPr>
+        <w:pStyle w:val="ListParagraph"/>
+        <w:numPr>
+          <w:ilvl w:val="0"/>
+          <w:numId w:val="2"/>
+        </w:numPr>
+        <w:spacing w:after="80"/>
+      </w:pPr>
+      <w:r>
+        <w:t xml:space="preserve">Las citas nuevas llegan en estado pendiente: debes Aprobar o Rechazar cada una antes de que se puedan cobrar o atender.</w:t>
+      </w:r>
+    </w:p>
+    <w:p>
+      <w:pPr>
+        <w:pStyle w:val="ListParagraph"/>
+        <w:numPr>
+          <w:ilvl w:val="0"/>
+          <w:numId w:val="2"/>
+        </w:numPr>
+        <w:spacing w:after="80"/>
+      </w:pPr>
+      <w:r>
+        <w:t xml:space="preserve">Un botón de acción rápida en cada cita te lleva directo al siguiente paso según su estado (aprobar → iniciar servicio → marcar como completada).</w:t>
       </w:r>
     </w:p>
     <w:p>
@@ -1903,41 +2240,7 @@
           <w:sz w:val="20"/>
           <w:szCs w:val="20"/>
         </w:rPr>
-        <w:t xml:space="preserve">Pantalla de reportes de ingresos con filtros.</w:t>
-      </w:r>
-    </w:p>
-    <w:p>
-      <w:pPr>
-        <w:pStyle w:val="Heading2"/>
-      </w:pPr>
-      <w:r>
-        <w:t xml:space="preserve">5.5 Campañas de marketing</w:t>
-      </w:r>
-    </w:p>
-    <w:p>
-      <w:pPr>
-        <w:pStyle w:val="ListParagraph"/>
-        <w:numPr>
-          <w:ilvl w:val="0"/>
-          <w:numId w:val="3"/>
-        </w:numPr>
-        <w:spacing w:after="80"/>
-      </w:pPr>
-      <w:r>
-        <w:t xml:space="preserve">Desde Campañas puedes redactar una promoción y enviarla ahora o programarla para una fecha futura.</w:t>
-      </w:r>
-    </w:p>
-    <w:p>
-      <w:pPr>
-        <w:pStyle w:val="ListParagraph"/>
-        <w:numPr>
-          <w:ilvl w:val="0"/>
-          <w:numId w:val="3"/>
-        </w:numPr>
-        <w:spacing w:after="80"/>
-      </w:pPr>
-      <w:r>
-        <w:t xml:space="preserve">Cada campaña muestra métricas de apertura y clics una vez enviada, para medir su efectividad.</w:t>
+        <w:t xml:space="preserve">Agenda del barbero — vista de línea de tiempo del día.</w:t>
       </w:r>
     </w:p>
     <w:p>
@@ -1990,7 +2293,7 @@
           <w:sz w:val="20"/>
           <w:szCs w:val="20"/>
         </w:rPr>
-        <w:t xml:space="preserve">Formulario de creación de campaña y sus métricas de apertura/clics.</w:t>
+        <w:t xml:space="preserve">Tarjeta de cita pendiente con los botones Aprobar / Rechazar.</w:t>
       </w:r>
     </w:p>
     <w:p>
@@ -1998,7 +2301,7 @@
         <w:pStyle w:val="Heading2"/>
       </w:pPr>
       <w:r>
-        <w:t xml:space="preserve">5.6 Configuración del negocio</w:t>
+        <w:t xml:space="preserve">4.2 Historial y desempeño</w:t>
       </w:r>
     </w:p>
     <w:p>
@@ -2006,135 +2309,7 @@
         <w:spacing w:after="160"/>
       </w:pPr>
       <w:r>
-        <w:t xml:space="preserve">Horario de apertura/cierre, política de cancelación y demás ajustes generales se administran desde Configuración.</w:t>
-      </w:r>
-    </w:p>
-    <w:p>
-      <w:pPr>
-        <w:pStyle w:val="Heading2"/>
-      </w:pPr>
-      <w:r>
-        <w:t xml:space="preserve">5.7 Analítica avanzada (módulo Spark)</w:t>
-      </w:r>
-    </w:p>
-    <w:p>
-      <w:pPr>
-        <w:spacing w:after="160"/>
-      </w:pPr>
-      <w:r>
-        <w:t xml:space="preserve">Además del resumen del día a día, la barbería cuenta con un dashboard de analítica aparte (construido con el módulo académico Spark), pensado para decisiones de negocio de más largo plazo. Se ejecuta por separado y ofrece, entre otras cosas:</w:t>
-      </w:r>
-    </w:p>
-    <w:p>
-      <w:pPr>
-        <w:pStyle w:val="ListParagraph"/>
-        <w:numPr>
-          <w:ilvl w:val="0"/>
-          <w:numId w:val="3"/>
-        </w:numPr>
-        <w:spacing w:after="80"/>
-      </w:pPr>
-      <w:r>
-        <w:t xml:space="preserve">Predicción de demanda: qué horarios y días tienen más movimiento, para planear turnos de personal.</w:t>
-      </w:r>
-    </w:p>
-    <w:p>
-      <w:pPr>
-        <w:pStyle w:val="ListParagraph"/>
-        <w:numPr>
-          <w:ilvl w:val="0"/>
-          <w:numId w:val="3"/>
-        </w:numPr>
-        <w:spacing w:after="80"/>
-      </w:pPr>
-      <w:r>
-        <w:t xml:space="preserve">Fidelización: cómo se distribuyen los puntos y niveles de los clientes.</w:t>
-      </w:r>
-    </w:p>
-    <w:p>
-      <w:pPr>
-        <w:pStyle w:val="ListParagraph"/>
-        <w:numPr>
-          <w:ilvl w:val="0"/>
-          <w:numId w:val="3"/>
-        </w:numPr>
-        <w:spacing w:after="80"/>
-      </w:pPr>
-      <w:r>
-        <w:t xml:space="preserve">Utilización de barberos: quién tiene agenda saturada y quién tiene disponibilidad.</w:t>
-      </w:r>
-    </w:p>
-    <w:p>
-      <w:pPr>
-        <w:pStyle w:val="ListParagraph"/>
-        <w:numPr>
-          <w:ilvl w:val="0"/>
-          <w:numId w:val="3"/>
-        </w:numPr>
-        <w:spacing w:after="80"/>
-      </w:pPr>
-      <w:r>
-        <w:t xml:space="preserve">Inventario: márgenes de los productos de venta y alertas de reorden.</w:t>
-      </w:r>
-    </w:p>
-    <w:p>
-      <w:pPr>
-        <w:pStyle w:val="ListParagraph"/>
-        <w:numPr>
-          <w:ilvl w:val="0"/>
-          <w:numId w:val="3"/>
-        </w:numPr>
-        <w:spacing w:after="80"/>
-      </w:pPr>
-      <w:r>
-        <w:t xml:space="preserve">Tienda y pedidos: qué tan bien convierten los add-ons de producto dentro de una cita frente a la tienda suelta, y qué productos se venden más.</w:t>
-      </w:r>
-    </w:p>
-    <w:p>
-      <w:pPr>
-        <w:pStyle w:val="ListParagraph"/>
-        <w:numPr>
-          <w:ilvl w:val="0"/>
-          <w:numId w:val="3"/>
-        </w:numPr>
-        <w:spacing w:after="80"/>
-      </w:pPr>
-      <w:r>
-        <w:t xml:space="preserve">Muro social: qué barberos generan más interacción con sus publicaciones, y si eso se relaciona con más citas.</w:t>
-      </w:r>
-    </w:p>
-    <w:p>
-      <w:pPr>
-        <w:pStyle w:val="ListParagraph"/>
-        <w:numPr>
-          <w:ilvl w:val="0"/>
-          <w:numId w:val="3"/>
-        </w:numPr>
-        <w:spacing w:after="80"/>
-      </w:pPr>
-      <w:r>
-        <w:t xml:space="preserve">Segmentación de clientes y recomendación: agrupa clientes con hábitos similares y sugiere qué servicios/productos ofrecerles.</w:t>
-      </w:r>
-    </w:p>
-    <w:p>
-      <w:pPr>
-        <w:pBdr>
-          <w:left w:val="single" w:color="B8860B" w:sz="24" w:space="8"/>
-        </w:pBdr>
-        <w:shd w:fill="F2F2F2" w:val="clear"/>
-        <w:spacing w:after="200" w:before="160"/>
-        <w:ind w:left="120"/>
-      </w:pPr>
-      <w:r>
-        <w:rPr>
-          <w:b/>
-          <w:bCs/>
-          <w:color w:val="B8860B"/>
-        </w:rPr>
-        <w:t xml:space="preserve">Nota:  </w:t>
-      </w:r>
-      <w:r>
-        <w:t xml:space="preserve"> este panel es de solo lectura sobre los mismos datos de la app — no se edita nada desde ahí, solo se consulta para tomar decisiones.</w:t>
+        <w:t xml:space="preserve">En tu panel principal ves tu historial de citas completadas y el total de propinas recibidas — útil para llevar cuenta de tus ingresos personales.</w:t>
       </w:r>
     </w:p>
     <w:p>
@@ -2187,7 +2362,41 @@
           <w:sz w:val="20"/>
           <w:szCs w:val="20"/>
         </w:rPr>
-        <w:t xml:space="preserve">Dashboard de analítica avanzada (Spark) — vista general.</w:t>
+        <w:t xml:space="preserve">Panel de historial y propinas del barbero.</w:t>
+      </w:r>
+    </w:p>
+    <w:p>
+      <w:pPr>
+        <w:pStyle w:val="Heading2"/>
+      </w:pPr>
+      <w:r>
+        <w:t xml:space="preserve">4.3 Mi perfil y horario</w:t>
+      </w:r>
+    </w:p>
+    <w:p>
+      <w:pPr>
+        <w:pStyle w:val="ListParagraph"/>
+        <w:numPr>
+          <w:ilvl w:val="0"/>
+          <w:numId w:val="2"/>
+        </w:numPr>
+        <w:spacing w:after="80"/>
+      </w:pPr>
+      <w:r>
+        <w:t xml:space="preserve">Entra a Mi perfil para editar tu foto, descripción y especialidad.</w:t>
+      </w:r>
+    </w:p>
+    <w:p>
+      <w:pPr>
+        <w:pStyle w:val="ListParagraph"/>
+        <w:numPr>
+          <w:ilvl w:val="0"/>
+          <w:numId w:val="2"/>
+        </w:numPr>
+        <w:spacing w:after="80"/>
+      </w:pPr>
+      <w:r>
+        <w:t xml:space="preserve">Entra a Mi horario para configurar tus días y horas de trabajo de la semana — esto es lo que el sistema usa para calcular qué horarios están disponibles cuando un cliente quiere reservar contigo.</w:t>
       </w:r>
     </w:p>
     <w:p>
@@ -2240,28 +2449,54 @@
           <w:sz w:val="20"/>
           <w:szCs w:val="20"/>
         </w:rPr>
-        <w:t xml:space="preserve">Dashboard de analítica avanzada (Spark) — pestaña de predicción de demanda.</w:t>
-      </w:r>
-    </w:p>
-    <w:p>
-      <w:r>
-        <w:br w:type="page"/>
-      </w:r>
-    </w:p>
-    <w:p>
-      <w:pPr>
-        <w:pStyle w:val="Heading1"/>
-      </w:pPr>
-      <w:r>
-        <w:t xml:space="preserve">6. Notificaciones</w:t>
-      </w:r>
-    </w:p>
-    <w:p>
-      <w:pPr>
-        <w:spacing w:after="160"/>
-      </w:pPr>
-      <w:r>
-        <w:t xml:space="preserve">Todos los roles reciben notificaciones automáticas por correo (y dentro de la app, en el ícono de campana) para eventos relevantes: confirmación o cancelación de cita, recordatorio antes de la cita, recibo de pago, pedido listo para entregar, y solicitud de reseña después de tu visita. Puedes ajustar qué notificaciones recibir (incluyendo promociones) desde tu perfil → preferencias de notificación.</w:t>
+        <w:t xml:space="preserve">Formulario de edición de perfil y de horario semanal.</w:t>
+      </w:r>
+    </w:p>
+    <w:p>
+      <w:pPr>
+        <w:pStyle w:val="Heading2"/>
+      </w:pPr>
+      <w:r>
+        <w:t xml:space="preserve">4.4 Publicar en el muro social</w:t>
+      </w:r>
+    </w:p>
+    <w:p>
+      <w:pPr>
+        <w:pStyle w:val="ListParagraph"/>
+        <w:numPr>
+          <w:ilvl w:val="0"/>
+          <w:numId w:val="2"/>
+        </w:numPr>
+        <w:spacing w:after="80"/>
+      </w:pPr>
+      <w:r>
+        <w:t xml:space="preserve">Entra a Muro inspiración o Mi portafolio.</w:t>
+      </w:r>
+    </w:p>
+    <w:p>
+      <w:pPr>
+        <w:pStyle w:val="ListParagraph"/>
+        <w:numPr>
+          <w:ilvl w:val="0"/>
+          <w:numId w:val="2"/>
+        </w:numPr>
+        <w:spacing w:after="80"/>
+      </w:pPr>
+      <w:r>
+        <w:t xml:space="preserve">Pulsa Nueva publicación, sube las fotos de tu trabajo y agrega un título/descripción.</w:t>
+      </w:r>
+    </w:p>
+    <w:p>
+      <w:pPr>
+        <w:pStyle w:val="ListParagraph"/>
+        <w:numPr>
+          <w:ilvl w:val="0"/>
+          <w:numId w:val="2"/>
+        </w:numPr>
+        <w:spacing w:after="80"/>
+      </w:pPr>
+      <w:r>
+        <w:t xml:space="preserve">Los clientes pueden comentar y reaccionar a tus publicaciones — es tu portafolio dentro de la app, útil para atraer clientes que buscan un estilo en particular.</w:t>
       </w:r>
     </w:p>
     <w:p>
@@ -2314,7 +2549,12 @@
           <w:sz w:val="20"/>
           <w:szCs w:val="20"/>
         </w:rPr>
-        <w:t xml:space="preserve">Centro de notificaciones (ícono de campana) y pantalla de preferencias.</w:t>
+        <w:t xml:space="preserve">Formulario para publicar un nuevo trabajo en el muro.</w:t>
+      </w:r>
+    </w:p>
+    <w:p>
+      <w:r>
+        <w:br w:type="page"/>
       </w:r>
     </w:p>
     <w:p>
@@ -2322,7 +2562,202 @@
         <w:pStyle w:val="Heading1"/>
       </w:pPr>
       <w:r>
-        <w:t xml:space="preserve">7. ¿Problemas para entrar o usar el sistema?</w:t>
+        <w:t xml:space="preserve">5. Rol: Cliente</w:t>
+      </w:r>
+    </w:p>
+    <w:p>
+      <w:pPr>
+        <w:spacing w:after="160"/>
+      </w:pPr>
+      <w:r>
+        <w:t xml:space="preserve">El cliente reserva citas, hace compras en la tienda, sigue su tarjeta de lealtad y explora el muro social — todo en modo autoservicio.</w:t>
+      </w:r>
+    </w:p>
+    <w:p>
+      <w:pPr>
+        <w:pStyle w:val="Heading2"/>
+      </w:pPr>
+      <w:r>
+        <w:t xml:space="preserve">5.1 Reservar una cita</w:t>
+      </w:r>
+    </w:p>
+    <w:p>
+      <w:pPr>
+        <w:pStyle w:val="ListParagraph"/>
+        <w:numPr>
+          <w:ilvl w:val="0"/>
+          <w:numId w:val="2"/>
+        </w:numPr>
+        <w:spacing w:after="80"/>
+      </w:pPr>
+      <w:r>
+        <w:t xml:space="preserve">En el menú, ve a Reservar cita.</w:t>
+      </w:r>
+    </w:p>
+    <w:p>
+      <w:pPr>
+        <w:pStyle w:val="ListParagraph"/>
+        <w:numPr>
+          <w:ilvl w:val="0"/>
+          <w:numId w:val="2"/>
+        </w:numPr>
+        <w:spacing w:after="80"/>
+      </w:pPr>
+      <w:r>
+        <w:t xml:space="preserve">Sigue el asistente paso a paso: elige el servicio, el barbero (o "sin preferencia"), la fecha (los domingos no están disponibles) y la hora.</w:t>
+      </w:r>
+    </w:p>
+    <w:p>
+      <w:pPr>
+        <w:pStyle w:val="ListParagraph"/>
+        <w:numPr>
+          <w:ilvl w:val="0"/>
+          <w:numId w:val="2"/>
+        </w:numPr>
+        <w:spacing w:after="80"/>
+      </w:pPr>
+      <w:r>
+        <w:t xml:space="preserve">Un resumen de tu selección queda siempre visible mientras avanzas, y puedes volver a cualquier paso anterior con un clic.</w:t>
+      </w:r>
+    </w:p>
+    <w:p>
+      <w:pPr>
+        <w:pStyle w:val="ListParagraph"/>
+        <w:numPr>
+          <w:ilvl w:val="0"/>
+          <w:numId w:val="2"/>
+        </w:numPr>
+        <w:spacing w:after="80"/>
+      </w:pPr>
+      <w:r>
+        <w:t xml:space="preserve">Opcionalmente puedes añadir productos a tu cita en el mismo asistente (add-on).</w:t>
+      </w:r>
+    </w:p>
+    <w:p>
+      <w:pPr>
+        <w:pStyle w:val="ListParagraph"/>
+        <w:numPr>
+          <w:ilvl w:val="0"/>
+          <w:numId w:val="2"/>
+        </w:numPr>
+        <w:spacing w:after="80"/>
+      </w:pPr>
+      <w:r>
+        <w:t xml:space="preserve">Confirma. Tu cita queda en estado pendiente hasta que el barbero la apruebe — recibirás una notificación cuando eso ocurra.</w:t>
+      </w:r>
+    </w:p>
+    <w:p>
+      <w:pPr>
+        <w:pBdr>
+          <w:top w:val="dashed" w:color="999999" w:sz="8" w:space="8"/>
+          <w:bottom w:val="dashed" w:color="999999" w:sz="8" w:space="8"/>
+          <w:left w:val="dashed" w:color="999999" w:sz="8" w:space="8"/>
+          <w:right w:val="dashed" w:color="999999" w:sz="8" w:space="8"/>
+        </w:pBdr>
+        <w:shd w:fill="F2F2F2" w:val="clear"/>
+        <w:spacing w:after="60" w:before="200"/>
+        <w:jc w:val="center"/>
+      </w:pPr>
+      <w:r>
+        <w:br/>
+        <w:br/>
+        <w:br/>
+        <w:br/>
+        <w:t xml:space="preserve"/>
+      </w:r>
+      <w:r>
+        <w:rPr>
+          <w:b/>
+          <w:bCs/>
+          <w:color w:val="666666"/>
+          <w:sz w:val="20"/>
+          <w:szCs w:val="20"/>
+        </w:rPr>
+        <w:t xml:space="preserve">📷  ESPACIO PARA CAPTURA DE PANTALLA</w:t>
+      </w:r>
+      <w:r>
+        <w:br/>
+        <w:br/>
+        <w:br/>
+        <w:br/>
+        <w:t xml:space="preserve"/>
+      </w:r>
+    </w:p>
+    <w:p>
+      <w:pPr>
+        <w:spacing w:after="260"/>
+        <w:jc w:val="center"/>
+      </w:pPr>
+      <w:r>
+        <w:rPr>
+          <w:i/>
+          <w:iCs/>
+          <w:color w:val="666666"/>
+          <w:sz w:val="20"/>
+          <w:szCs w:val="20"/>
+        </w:rPr>
+        <w:t xml:space="preserve">Asistente de reserva — selección de servicio y barbero.</w:t>
+      </w:r>
+    </w:p>
+    <w:p>
+      <w:pPr>
+        <w:pBdr>
+          <w:top w:val="dashed" w:color="999999" w:sz="8" w:space="8"/>
+          <w:bottom w:val="dashed" w:color="999999" w:sz="8" w:space="8"/>
+          <w:left w:val="dashed" w:color="999999" w:sz="8" w:space="8"/>
+          <w:right w:val="dashed" w:color="999999" w:sz="8" w:space="8"/>
+        </w:pBdr>
+        <w:shd w:fill="F2F2F2" w:val="clear"/>
+        <w:spacing w:after="60" w:before="200"/>
+        <w:jc w:val="center"/>
+      </w:pPr>
+      <w:r>
+        <w:br/>
+        <w:br/>
+        <w:br/>
+        <w:br/>
+        <w:t xml:space="preserve"/>
+      </w:r>
+      <w:r>
+        <w:rPr>
+          <w:b/>
+          <w:bCs/>
+          <w:color w:val="666666"/>
+          <w:sz w:val="20"/>
+          <w:szCs w:val="20"/>
+        </w:rPr>
+        <w:t xml:space="preserve">📷  ESPACIO PARA CAPTURA DE PANTALLA</w:t>
+      </w:r>
+      <w:r>
+        <w:br/>
+        <w:br/>
+        <w:br/>
+        <w:br/>
+        <w:t xml:space="preserve"/>
+      </w:r>
+    </w:p>
+    <w:p>
+      <w:pPr>
+        <w:spacing w:after="260"/>
+        <w:jc w:val="center"/>
+      </w:pPr>
+      <w:r>
+        <w:rPr>
+          <w:i/>
+          <w:iCs/>
+          <w:color w:val="666666"/>
+          <w:sz w:val="20"/>
+          <w:szCs w:val="20"/>
+        </w:rPr>
+        <w:t xml:space="preserve">Asistente de reserva — resumen final y confirmación.</w:t>
+      </w:r>
+    </w:p>
+    <w:p>
+      <w:pPr>
+        <w:pStyle w:val="Heading2"/>
+      </w:pPr>
+      <w:r>
+        <w:t xml:space="preserve">5.2 Mis citas</w:t>
       </w:r>
     </w:p>
     <w:p>
@@ -2335,7 +2770,7 @@
         <w:spacing w:after="80"/>
       </w:pPr>
       <w:r>
-        <w:t xml:space="preserve">Si olvidaste tu contraseña, usa la opción ¿Olvidaste tu contraseña? en la pantalla de acceso.</w:t>
+        <w:t xml:space="preserve">En Mis citas puedes ver el historial completo y el estado de cada una: pendiente, confirmada, en proceso, completada, cancelada o no asistida.</w:t>
       </w:r>
     </w:p>
     <w:p>
@@ -2348,9 +2783,1154 @@
         <w:spacing w:after="80"/>
       </w:pPr>
       <w:r>
-        <w:t xml:space="preserve">Si algo no carga o ves un error, contacta al administrador del sistema con una captura de pantalla — ayuda mucho a diagnosticar el problema rápido.</w:t>
-      </w:r>
-    </w:p>
+        <w:t xml:space="preserve">Puedes cancelar una cita mientras no haya iniciado el servicio.</w:t>
+      </w:r>
+    </w:p>
+    <w:p>
+      <w:pPr>
+        <w:pStyle w:val="ListParagraph"/>
+        <w:numPr>
+          <w:ilvl w:val="0"/>
+          <w:numId w:val="3"/>
+        </w:numPr>
+        <w:spacing w:after="80"/>
+      </w:pPr>
+      <w:r>
+        <w:t xml:space="preserve">Cuando confirman tu cita, te llega un correo con la opción de agregarla a tu calendario (Google Calendar o archivo .ics).</w:t>
+      </w:r>
+    </w:p>
+    <w:p>
+      <w:pPr>
+        <w:pBdr>
+          <w:top w:val="dashed" w:color="999999" w:sz="8" w:space="8"/>
+          <w:bottom w:val="dashed" w:color="999999" w:sz="8" w:space="8"/>
+          <w:left w:val="dashed" w:color="999999" w:sz="8" w:space="8"/>
+          <w:right w:val="dashed" w:color="999999" w:sz="8" w:space="8"/>
+        </w:pBdr>
+        <w:shd w:fill="F2F2F2" w:val="clear"/>
+        <w:spacing w:after="60" w:before="200"/>
+        <w:jc w:val="center"/>
+      </w:pPr>
+      <w:r>
+        <w:br/>
+        <w:br/>
+        <w:br/>
+        <w:br/>
+        <w:t xml:space="preserve"/>
+      </w:r>
+      <w:r>
+        <w:rPr>
+          <w:b/>
+          <w:bCs/>
+          <w:color w:val="666666"/>
+          <w:sz w:val="20"/>
+          <w:szCs w:val="20"/>
+        </w:rPr>
+        <w:t xml:space="preserve">📷  ESPACIO PARA CAPTURA DE PANTALLA</w:t>
+      </w:r>
+      <w:r>
+        <w:br/>
+        <w:br/>
+        <w:br/>
+        <w:br/>
+        <w:t xml:space="preserve"/>
+      </w:r>
+    </w:p>
+    <w:p>
+      <w:pPr>
+        <w:spacing w:after="260"/>
+        <w:jc w:val="center"/>
+      </w:pPr>
+      <w:r>
+        <w:rPr>
+          <w:i/>
+          <w:iCs/>
+          <w:color w:val="666666"/>
+          <w:sz w:val="20"/>
+          <w:szCs w:val="20"/>
+        </w:rPr>
+        <w:t xml:space="preserve">Pantalla "Mis citas" con el listado y sus estados.</w:t>
+      </w:r>
+    </w:p>
+    <w:p>
+      <w:pPr>
+        <w:pStyle w:val="Heading2"/>
+      </w:pPr>
+      <w:r>
+        <w:t xml:space="preserve">5.3 Tienda y pedidos</w:t>
+      </w:r>
+    </w:p>
+    <w:p>
+      <w:pPr>
+        <w:pStyle w:val="ListParagraph"/>
+        <w:numPr>
+          <w:ilvl w:val="0"/>
+          <w:numId w:val="3"/>
+        </w:numPr>
+        <w:spacing w:after="80"/>
+      </w:pPr>
+      <w:r>
+        <w:t xml:space="preserve">En Tienda puedes ver el catálogo de productos, agregarlos al carrito y hacer un pedido independiente de cualquier cita.</w:t>
+      </w:r>
+    </w:p>
+    <w:p>
+      <w:pPr>
+        <w:pStyle w:val="ListParagraph"/>
+        <w:numPr>
+          <w:ilvl w:val="0"/>
+          <w:numId w:val="3"/>
+        </w:numPr>
+        <w:spacing w:after="80"/>
+      </w:pPr>
+      <w:r>
+        <w:t xml:space="preserve">En Mis pedidos ves el estado de tus compras (pendiente / entregado / cancelado). Recibes una notificación cuando tu pedido está listo para recoger en recepción.</w:t>
+      </w:r>
+    </w:p>
+    <w:p>
+      <w:pPr>
+        <w:pBdr>
+          <w:top w:val="dashed" w:color="999999" w:sz="8" w:space="8"/>
+          <w:bottom w:val="dashed" w:color="999999" w:sz="8" w:space="8"/>
+          <w:left w:val="dashed" w:color="999999" w:sz="8" w:space="8"/>
+          <w:right w:val="dashed" w:color="999999" w:sz="8" w:space="8"/>
+        </w:pBdr>
+        <w:shd w:fill="F2F2F2" w:val="clear"/>
+        <w:spacing w:after="60" w:before="200"/>
+        <w:jc w:val="center"/>
+      </w:pPr>
+      <w:r>
+        <w:br/>
+        <w:br/>
+        <w:br/>
+        <w:br/>
+        <w:t xml:space="preserve"/>
+      </w:r>
+      <w:r>
+        <w:rPr>
+          <w:b/>
+          <w:bCs/>
+          <w:color w:val="666666"/>
+          <w:sz w:val="20"/>
+          <w:szCs w:val="20"/>
+        </w:rPr>
+        <w:t xml:space="preserve">📷  ESPACIO PARA CAPTURA DE PANTALLA</w:t>
+      </w:r>
+      <w:r>
+        <w:br/>
+        <w:br/>
+        <w:br/>
+        <w:br/>
+        <w:t xml:space="preserve"/>
+      </w:r>
+    </w:p>
+    <w:p>
+      <w:pPr>
+        <w:spacing w:after="260"/>
+        <w:jc w:val="center"/>
+      </w:pPr>
+      <w:r>
+        <w:rPr>
+          <w:i/>
+          <w:iCs/>
+          <w:color w:val="666666"/>
+          <w:sz w:val="20"/>
+          <w:szCs w:val="20"/>
+        </w:rPr>
+        <w:t xml:space="preserve">Catálogo de la tienda, carrito de compras, y la pantalla "Mis pedidos".</w:t>
+      </w:r>
+    </w:p>
+    <w:p>
+      <w:pPr>
+        <w:pStyle w:val="Heading2"/>
+      </w:pPr>
+      <w:r>
+        <w:t xml:space="preserve">5.4 Facturas</w:t>
+      </w:r>
+    </w:p>
+    <w:p>
+      <w:pPr>
+        <w:spacing w:after="160"/>
+      </w:pPr>
+      <w:r>
+        <w:t xml:space="preserve">En Facturas puedes ver y descargar en PDF el comprobante de cada cita pagada.</w:t>
+      </w:r>
+    </w:p>
+    <w:p>
+      <w:pPr>
+        <w:pBdr>
+          <w:top w:val="dashed" w:color="999999" w:sz="8" w:space="8"/>
+          <w:bottom w:val="dashed" w:color="999999" w:sz="8" w:space="8"/>
+          <w:left w:val="dashed" w:color="999999" w:sz="8" w:space="8"/>
+          <w:right w:val="dashed" w:color="999999" w:sz="8" w:space="8"/>
+        </w:pBdr>
+        <w:shd w:fill="F2F2F2" w:val="clear"/>
+        <w:spacing w:after="60" w:before="200"/>
+        <w:jc w:val="center"/>
+      </w:pPr>
+      <w:r>
+        <w:br/>
+        <w:br/>
+        <w:br/>
+        <w:br/>
+        <w:t xml:space="preserve"/>
+      </w:r>
+      <w:r>
+        <w:rPr>
+          <w:b/>
+          <w:bCs/>
+          <w:color w:val="666666"/>
+          <w:sz w:val="20"/>
+          <w:szCs w:val="20"/>
+        </w:rPr>
+        <w:t xml:space="preserve">📷  ESPACIO PARA CAPTURA DE PANTALLA</w:t>
+      </w:r>
+      <w:r>
+        <w:br/>
+        <w:br/>
+        <w:br/>
+        <w:br/>
+        <w:t xml:space="preserve"/>
+      </w:r>
+    </w:p>
+    <w:p>
+      <w:pPr>
+        <w:spacing w:after="260"/>
+        <w:jc w:val="center"/>
+      </w:pPr>
+      <w:r>
+        <w:rPr>
+          <w:i/>
+          <w:iCs/>
+          <w:color w:val="666666"/>
+          <w:sz w:val="20"/>
+          <w:szCs w:val="20"/>
+        </w:rPr>
+        <w:t xml:space="preserve">Listado de facturas y una factura descargada en PDF.</w:t>
+      </w:r>
+    </w:p>
+    <w:p>
+      <w:pPr>
+        <w:pStyle w:val="Heading2"/>
+      </w:pPr>
+      <w:r>
+        <w:t xml:space="preserve">5.5 Tarjeta de socio y puntos</w:t>
+      </w:r>
+    </w:p>
+    <w:p>
+      <w:pPr>
+        <w:pStyle w:val="ListParagraph"/>
+        <w:numPr>
+          <w:ilvl w:val="0"/>
+          <w:numId w:val="3"/>
+        </w:numPr>
+        <w:spacing w:after="80"/>
+      </w:pPr>
+      <w:r>
+        <w:t xml:space="preserve">Tu panel principal muestra tu tarjeta de membresía con tu nivel actual (Nuevo, Regular, VIP, Leyenda) y tus puntos de fidelidad, que suman automáticamente cada vez que completas una cita.</w:t>
+      </w:r>
+    </w:p>
+    <w:p>
+      <w:pPr>
+        <w:pStyle w:val="ListParagraph"/>
+        <w:numPr>
+          <w:ilvl w:val="0"/>
+          <w:numId w:val="3"/>
+        </w:numPr>
+        <w:spacing w:after="80"/>
+      </w:pPr>
+      <w:r>
+        <w:t xml:space="preserve">Toca la tarjeta para voltearla y ver tu código QR de identificación, o descárgala en PDF.</w:t>
+      </w:r>
+    </w:p>
+    <w:p>
+      <w:pPr>
+        <w:pBdr>
+          <w:top w:val="dashed" w:color="999999" w:sz="8" w:space="8"/>
+          <w:bottom w:val="dashed" w:color="999999" w:sz="8" w:space="8"/>
+          <w:left w:val="dashed" w:color="999999" w:sz="8" w:space="8"/>
+          <w:right w:val="dashed" w:color="999999" w:sz="8" w:space="8"/>
+        </w:pBdr>
+        <w:shd w:fill="F2F2F2" w:val="clear"/>
+        <w:spacing w:after="60" w:before="200"/>
+        <w:jc w:val="center"/>
+      </w:pPr>
+      <w:r>
+        <w:br/>
+        <w:br/>
+        <w:br/>
+        <w:br/>
+        <w:t xml:space="preserve"/>
+      </w:r>
+      <w:r>
+        <w:rPr>
+          <w:b/>
+          <w:bCs/>
+          <w:color w:val="666666"/>
+          <w:sz w:val="20"/>
+          <w:szCs w:val="20"/>
+        </w:rPr>
+        <w:t xml:space="preserve">📷  ESPACIO PARA CAPTURA DE PANTALLA</w:t>
+      </w:r>
+      <w:r>
+        <w:br/>
+        <w:br/>
+        <w:br/>
+        <w:br/>
+        <w:t xml:space="preserve"/>
+      </w:r>
+    </w:p>
+    <w:p>
+      <w:pPr>
+        <w:spacing w:after="260"/>
+        <w:jc w:val="center"/>
+      </w:pPr>
+      <w:r>
+        <w:rPr>
+          <w:i/>
+          <w:iCs/>
+          <w:color w:val="666666"/>
+          <w:sz w:val="20"/>
+          <w:szCs w:val="20"/>
+        </w:rPr>
+        <w:t xml:space="preserve">Tarjeta de membresía (frente con nivel/puntos y reverso con QR).</w:t>
+      </w:r>
+    </w:p>
+    <w:p>
+      <w:pPr>
+        <w:pStyle w:val="Heading2"/>
+      </w:pPr>
+      <w:r>
+        <w:t xml:space="preserve">5.6 Barberos y reseñas</w:t>
+      </w:r>
+    </w:p>
+    <w:p>
+      <w:pPr>
+        <w:pStyle w:val="ListParagraph"/>
+        <w:numPr>
+          <w:ilvl w:val="0"/>
+          <w:numId w:val="2"/>
+        </w:numPr>
+        <w:spacing w:after="80"/>
+      </w:pPr>
+      <w:r>
+        <w:t xml:space="preserve">Entra a Barberos para ver el listado y el perfil público de cada uno (incluyendo su portafolio de trabajos).</w:t>
+      </w:r>
+    </w:p>
+    <w:p>
+      <w:pPr>
+        <w:pStyle w:val="ListParagraph"/>
+        <w:numPr>
+          <w:ilvl w:val="0"/>
+          <w:numId w:val="2"/>
+        </w:numPr>
+        <w:spacing w:after="80"/>
+      </w:pPr>
+      <w:r>
+        <w:t xml:space="preserve">Después de una cita completada, puedes dejar una reseña con calificación desde el perfil del barbero.</w:t>
+      </w:r>
+    </w:p>
+    <w:p>
+      <w:pPr>
+        <w:pBdr>
+          <w:top w:val="dashed" w:color="999999" w:sz="8" w:space="8"/>
+          <w:bottom w:val="dashed" w:color="999999" w:sz="8" w:space="8"/>
+          <w:left w:val="dashed" w:color="999999" w:sz="8" w:space="8"/>
+          <w:right w:val="dashed" w:color="999999" w:sz="8" w:space="8"/>
+        </w:pBdr>
+        <w:shd w:fill="F2F2F2" w:val="clear"/>
+        <w:spacing w:after="60" w:before="200"/>
+        <w:jc w:val="center"/>
+      </w:pPr>
+      <w:r>
+        <w:br/>
+        <w:br/>
+        <w:br/>
+        <w:br/>
+        <w:t xml:space="preserve"/>
+      </w:r>
+      <w:r>
+        <w:rPr>
+          <w:b/>
+          <w:bCs/>
+          <w:color w:val="666666"/>
+          <w:sz w:val="20"/>
+          <w:szCs w:val="20"/>
+        </w:rPr>
+        <w:t xml:space="preserve">📷  ESPACIO PARA CAPTURA DE PANTALLA</w:t>
+      </w:r>
+      <w:r>
+        <w:br/>
+        <w:br/>
+        <w:br/>
+        <w:br/>
+        <w:t xml:space="preserve"/>
+      </w:r>
+    </w:p>
+    <w:p>
+      <w:pPr>
+        <w:spacing w:after="260"/>
+        <w:jc w:val="center"/>
+      </w:pPr>
+      <w:r>
+        <w:rPr>
+          <w:i/>
+          <w:iCs/>
+          <w:color w:val="666666"/>
+          <w:sz w:val="20"/>
+          <w:szCs w:val="20"/>
+        </w:rPr>
+        <w:t xml:space="preserve">Perfil público de un barbero y el formulario para dejar una reseña.</w:t>
+      </w:r>
+    </w:p>
+    <w:p>
+      <w:pPr>
+        <w:pStyle w:val="Heading2"/>
+      </w:pPr>
+      <w:r>
+        <w:t xml:space="preserve">5.7 Muro de inspiración</w:t>
+      </w:r>
+    </w:p>
+    <w:p>
+      <w:pPr>
+        <w:spacing w:after="160"/>
+      </w:pPr>
+      <w:r>
+        <w:t xml:space="preserve">Explora los trabajos que publican los barberos, deja comentarios y reacciones, y guarda tus favoritos — útil para elegir estilo y barbero antes de reservar.</w:t>
+      </w:r>
+    </w:p>
+    <w:p>
+      <w:pPr>
+        <w:pBdr>
+          <w:top w:val="dashed" w:color="999999" w:sz="8" w:space="8"/>
+          <w:bottom w:val="dashed" w:color="999999" w:sz="8" w:space="8"/>
+          <w:left w:val="dashed" w:color="999999" w:sz="8" w:space="8"/>
+          <w:right w:val="dashed" w:color="999999" w:sz="8" w:space="8"/>
+        </w:pBdr>
+        <w:shd w:fill="F2F2F2" w:val="clear"/>
+        <w:spacing w:after="60" w:before="200"/>
+        <w:jc w:val="center"/>
+      </w:pPr>
+      <w:r>
+        <w:br/>
+        <w:br/>
+        <w:br/>
+        <w:br/>
+        <w:t xml:space="preserve"/>
+      </w:r>
+      <w:r>
+        <w:rPr>
+          <w:b/>
+          <w:bCs/>
+          <w:color w:val="666666"/>
+          <w:sz w:val="20"/>
+          <w:szCs w:val="20"/>
+        </w:rPr>
+        <w:t xml:space="preserve">📷  ESPACIO PARA CAPTURA DE PANTALLA</w:t>
+      </w:r>
+      <w:r>
+        <w:br/>
+        <w:br/>
+        <w:br/>
+        <w:br/>
+        <w:t xml:space="preserve"/>
+      </w:r>
+    </w:p>
+    <w:p>
+      <w:pPr>
+        <w:spacing w:after="260"/>
+        <w:jc w:val="center"/>
+      </w:pPr>
+      <w:r>
+        <w:rPr>
+          <w:i/>
+          <w:iCs/>
+          <w:color w:val="666666"/>
+          <w:sz w:val="20"/>
+          <w:szCs w:val="20"/>
+        </w:rPr>
+        <w:t xml:space="preserve">Muro de inspiración con publicaciones de barberos.</w:t>
+      </w:r>
+    </w:p>
+    <w:p>
+      <w:r>
+        <w:br w:type="page"/>
+      </w:r>
+    </w:p>
+    <w:p>
+      <w:pPr>
+        <w:pStyle w:val="Heading1"/>
+      </w:pPr>
+      <w:r>
+        <w:t xml:space="preserve">6. Notificaciones y preferencias (todos los roles)</w:t>
+      </w:r>
+    </w:p>
+    <w:p>
+      <w:pPr>
+        <w:spacing w:after="160"/>
+      </w:pPr>
+      <w:r>
+        <w:t xml:space="preserve">Todos los roles reciben notificaciones automáticas por correo y dentro de la app (ícono de campana) para eventos relevantes según su rol: confirmación/cancelación de cita, recordatorios, recibo de pago, pedido listo, solicitud de reseña, alertas de stock bajo (admin), resumen diario del negocio (admin), subida de nivel de lealtad (cliente).</w:t>
+      </w:r>
+    </w:p>
+    <w:p>
+      <w:pPr>
+        <w:pStyle w:val="ListParagraph"/>
+        <w:numPr>
+          <w:ilvl w:val="0"/>
+          <w:numId w:val="2"/>
+        </w:numPr>
+        <w:spacing w:after="80"/>
+      </w:pPr>
+      <w:r>
+        <w:t xml:space="preserve">Pulsa el ícono de campana (esquina superior) para ver tus notificaciones recientes.</w:t>
+      </w:r>
+    </w:p>
+    <w:p>
+      <w:pPr>
+        <w:pStyle w:val="ListParagraph"/>
+        <w:numPr>
+          <w:ilvl w:val="0"/>
+          <w:numId w:val="2"/>
+        </w:numPr>
+        <w:spacing w:after="80"/>
+      </w:pPr>
+      <w:r>
+        <w:t xml:space="preserve">Entra a tu perfil → Preferencias de notificación para elegir qué notificaciones recibir por cada canal (correo, in-app), incluyendo si quieres recibir promociones.</w:t>
+      </w:r>
+    </w:p>
+    <w:p>
+      <w:pPr>
+        <w:pBdr>
+          <w:top w:val="dashed" w:color="999999" w:sz="8" w:space="8"/>
+          <w:bottom w:val="dashed" w:color="999999" w:sz="8" w:space="8"/>
+          <w:left w:val="dashed" w:color="999999" w:sz="8" w:space="8"/>
+          <w:right w:val="dashed" w:color="999999" w:sz="8" w:space="8"/>
+        </w:pBdr>
+        <w:shd w:fill="F2F2F2" w:val="clear"/>
+        <w:spacing w:after="60" w:before="200"/>
+        <w:jc w:val="center"/>
+      </w:pPr>
+      <w:r>
+        <w:br/>
+        <w:br/>
+        <w:br/>
+        <w:br/>
+        <w:t xml:space="preserve"/>
+      </w:r>
+      <w:r>
+        <w:rPr>
+          <w:b/>
+          <w:bCs/>
+          <w:color w:val="666666"/>
+          <w:sz w:val="20"/>
+          <w:szCs w:val="20"/>
+        </w:rPr>
+        <w:t xml:space="preserve">📷  ESPACIO PARA CAPTURA DE PANTALLA</w:t>
+      </w:r>
+      <w:r>
+        <w:br/>
+        <w:br/>
+        <w:br/>
+        <w:br/>
+        <w:t xml:space="preserve"/>
+      </w:r>
+    </w:p>
+    <w:p>
+      <w:pPr>
+        <w:spacing w:after="260"/>
+        <w:jc w:val="center"/>
+      </w:pPr>
+      <w:r>
+        <w:rPr>
+          <w:i/>
+          <w:iCs/>
+          <w:color w:val="666666"/>
+          <w:sz w:val="20"/>
+          <w:szCs w:val="20"/>
+        </w:rPr>
+        <w:t xml:space="preserve">Centro de notificaciones (ícono de campana) y la pantalla de preferencias.</w:t>
+      </w:r>
+    </w:p>
+    <w:p>
+      <w:r>
+        <w:br w:type="page"/>
+      </w:r>
+    </w:p>
+    <w:p>
+      <w:pPr>
+        <w:pStyle w:val="Heading1"/>
+      </w:pPr>
+      <w:r>
+        <w:t xml:space="preserve">7. Asistente virtual (chatbot)</w:t>
+      </w:r>
+    </w:p>
+    <w:p>
+      <w:pPr>
+        <w:spacing w:after="160"/>
+      </w:pPr>
+      <w:r>
+        <w:t xml:space="preserve">En la esquina inferior de cualquier pantalla encontrarás un ícono de chat — es un asistente con inteligencia artificial que puede responder preguntas sobre horarios, servicios, precios y disponibilidad, e incluso ayudarte a reservar una cita conversacionalmente.</w:t>
+      </w:r>
+    </w:p>
+    <w:p>
+      <w:pPr>
+        <w:pStyle w:val="ListParagraph"/>
+        <w:numPr>
+          <w:ilvl w:val="0"/>
+          <w:numId w:val="2"/>
+        </w:numPr>
+        <w:spacing w:after="80"/>
+      </w:pPr>
+      <w:r>
+        <w:t xml:space="preserve">Pulsa el ícono de chat para abrir el asistente.</w:t>
+      </w:r>
+    </w:p>
+    <w:p>
+      <w:pPr>
+        <w:pStyle w:val="ListParagraph"/>
+        <w:numPr>
+          <w:ilvl w:val="0"/>
+          <w:numId w:val="2"/>
+        </w:numPr>
+        <w:spacing w:after="80"/>
+      </w:pPr>
+      <w:r>
+        <w:t xml:space="preserve">Escribe tu pregunta en lenguaje natural (por ejemplo, "¿Qué horarios tiene disponibles Carlos el viernes?").</w:t>
+      </w:r>
+    </w:p>
+    <w:p>
+      <w:pPr>
+        <w:pStyle w:val="ListParagraph"/>
+        <w:numPr>
+          <w:ilvl w:val="0"/>
+          <w:numId w:val="2"/>
+        </w:numPr>
+        <w:spacing w:after="80"/>
+      </w:pPr>
+      <w:r>
+        <w:t xml:space="preserve">El asistente recuerda el contexto de tu conversación mientras la ventana esté abierta.</w:t>
+      </w:r>
+    </w:p>
+    <w:p>
+      <w:pPr>
+        <w:pBdr>
+          <w:top w:val="dashed" w:color="999999" w:sz="8" w:space="8"/>
+          <w:bottom w:val="dashed" w:color="999999" w:sz="8" w:space="8"/>
+          <w:left w:val="dashed" w:color="999999" w:sz="8" w:space="8"/>
+          <w:right w:val="dashed" w:color="999999" w:sz="8" w:space="8"/>
+        </w:pBdr>
+        <w:shd w:fill="F2F2F2" w:val="clear"/>
+        <w:spacing w:after="60" w:before="200"/>
+        <w:jc w:val="center"/>
+      </w:pPr>
+      <w:r>
+        <w:br/>
+        <w:br/>
+        <w:br/>
+        <w:br/>
+        <w:t xml:space="preserve"/>
+      </w:r>
+      <w:r>
+        <w:rPr>
+          <w:b/>
+          <w:bCs/>
+          <w:color w:val="666666"/>
+          <w:sz w:val="20"/>
+          <w:szCs w:val="20"/>
+        </w:rPr>
+        <w:t xml:space="preserve">📷  ESPACIO PARA CAPTURA DE PANTALLA</w:t>
+      </w:r>
+      <w:r>
+        <w:br/>
+        <w:br/>
+        <w:br/>
+        <w:br/>
+        <w:t xml:space="preserve"/>
+      </w:r>
+    </w:p>
+    <w:p>
+      <w:pPr>
+        <w:spacing w:after="260"/>
+        <w:jc w:val="center"/>
+      </w:pPr>
+      <w:r>
+        <w:rPr>
+          <w:i/>
+          <w:iCs/>
+          <w:color w:val="666666"/>
+          <w:sz w:val="20"/>
+          <w:szCs w:val="20"/>
+        </w:rPr>
+        <w:t xml:space="preserve">Widget del chatbot abierto con una conversación de ejemplo.</w:t>
+      </w:r>
+    </w:p>
+    <w:p>
+      <w:r>
+        <w:br w:type="page"/>
+      </w:r>
+    </w:p>
+    <w:p>
+      <w:pPr>
+        <w:pStyle w:val="Heading1"/>
+      </w:pPr>
+      <w:r>
+        <w:t xml:space="preserve">8. Preguntas frecuentes y solución de problemas</w:t>
+      </w:r>
+    </w:p>
+    <w:tbl>
+      <w:tblPr>
+        <w:tblW w:type="dxa" w:w="9560"/>
+        <w:tblBorders>
+          <w:top w:val="single" w:color="auto" w:sz="4"/>
+          <w:left w:val="single" w:color="auto" w:sz="4"/>
+          <w:bottom w:val="single" w:color="auto" w:sz="4"/>
+          <w:right w:val="single" w:color="auto" w:sz="4"/>
+          <w:insideH w:val="single" w:color="auto" w:sz="4"/>
+          <w:insideV w:val="single" w:color="auto" w:sz="4"/>
+        </w:tblBorders>
+      </w:tblPr>
+      <w:tblGrid>
+        <w:gridCol w:w="3200"/>
+        <w:gridCol w:w="6360"/>
+      </w:tblGrid>
+      <w:tr>
+        <w:trPr>
+          <w:tblHeader/>
+        </w:trPr>
+        <w:tc>
+          <w:tcPr>
+            <w:tcW w:type="auto" w:w="0"/>
+            <w:shd w:fill="1A1A1A" w:val="clear"/>
+            <w:tcMar>
+              <w:top w:type="dxa" w:w="80"/>
+              <w:left w:type="dxa" w:w="120"/>
+              <w:bottom w:type="dxa" w:w="80"/>
+              <w:right w:type="dxa" w:w="120"/>
+            </w:tcMar>
+          </w:tcPr>
+          <w:p>
+            <w:r>
+              <w:rPr>
+                <w:b/>
+                <w:bCs/>
+                <w:color w:val="FFFFFF"/>
+                <w:sz w:val="20"/>
+                <w:szCs w:val="20"/>
+              </w:rPr>
+              <w:t xml:space="preserve">Pregunta / problema</w:t>
+            </w:r>
+          </w:p>
+        </w:tc>
+        <w:tc>
+          <w:tcPr>
+            <w:tcW w:type="auto" w:w="0"/>
+            <w:shd w:fill="1A1A1A" w:val="clear"/>
+            <w:tcMar>
+              <w:top w:type="dxa" w:w="80"/>
+              <w:left w:type="dxa" w:w="120"/>
+              <w:bottom w:type="dxa" w:w="80"/>
+              <w:right w:type="dxa" w:w="120"/>
+            </w:tcMar>
+          </w:tcPr>
+          <w:p>
+            <w:r>
+              <w:rPr>
+                <w:b/>
+                <w:bCs/>
+                <w:color w:val="FFFFFF"/>
+                <w:sz w:val="20"/>
+                <w:szCs w:val="20"/>
+              </w:rPr>
+              <w:t xml:space="preserve">Respuesta</w:t>
+            </w:r>
+          </w:p>
+        </w:tc>
+      </w:tr>
+      <w:tr>
+        <w:tc>
+          <w:tcPr>
+            <w:tcW w:type="auto" w:w="0"/>
+            <w:tcMar>
+              <w:top w:type="dxa" w:w="80"/>
+              <w:left w:type="dxa" w:w="120"/>
+              <w:bottom w:type="dxa" w:w="80"/>
+              <w:right w:type="dxa" w:w="120"/>
+            </w:tcMar>
+          </w:tcPr>
+          <w:p>
+            <w:r>
+              <w:rPr>
+                <w:b w:val="false"/>
+                <w:bCs w:val="false"/>
+                <w:color w:val="000000"/>
+                <w:sz w:val="20"/>
+                <w:szCs w:val="20"/>
+              </w:rPr>
+              <w:t xml:space="preserve">Olvidé mi contraseña</w:t>
+            </w:r>
+          </w:p>
+        </w:tc>
+        <w:tc>
+          <w:tcPr>
+            <w:tcW w:type="auto" w:w="0"/>
+            <w:tcMar>
+              <w:top w:type="dxa" w:w="80"/>
+              <w:left w:type="dxa" w:w="120"/>
+              <w:bottom w:type="dxa" w:w="80"/>
+              <w:right w:type="dxa" w:w="120"/>
+            </w:tcMar>
+          </w:tcPr>
+          <w:p>
+            <w:r>
+              <w:rPr>
+                <w:b w:val="false"/>
+                <w:bCs w:val="false"/>
+                <w:color w:val="000000"/>
+                <w:sz w:val="20"/>
+                <w:szCs w:val="20"/>
+              </w:rPr>
+              <w:t xml:space="preserve">Usa ¿Olvidaste tu contraseña? en la pantalla de acceso; te llegará un correo con un enlace para restablecerla.</w:t>
+            </w:r>
+          </w:p>
+        </w:tc>
+      </w:tr>
+      <w:tr>
+        <w:tc>
+          <w:tcPr>
+            <w:tcW w:type="auto" w:w="0"/>
+            <w:tcMar>
+              <w:top w:type="dxa" w:w="80"/>
+              <w:left w:type="dxa" w:w="120"/>
+              <w:bottom w:type="dxa" w:w="80"/>
+              <w:right w:type="dxa" w:w="120"/>
+            </w:tcMar>
+          </w:tcPr>
+          <w:p>
+            <w:r>
+              <w:rPr>
+                <w:b w:val="false"/>
+                <w:bCs w:val="false"/>
+                <w:color w:val="000000"/>
+                <w:sz w:val="20"/>
+                <w:szCs w:val="20"/>
+              </w:rPr>
+              <w:t xml:space="preserve">Reservé una cita pero sigue en "pendiente"</w:t>
+            </w:r>
+          </w:p>
+        </w:tc>
+        <w:tc>
+          <w:tcPr>
+            <w:tcW w:type="auto" w:w="0"/>
+            <w:tcMar>
+              <w:top w:type="dxa" w:w="80"/>
+              <w:left w:type="dxa" w:w="120"/>
+              <w:bottom w:type="dxa" w:w="80"/>
+              <w:right w:type="dxa" w:w="120"/>
+            </w:tcMar>
+          </w:tcPr>
+          <w:p>
+            <w:r>
+              <w:rPr>
+                <w:b w:val="false"/>
+                <w:bCs w:val="false"/>
+                <w:color w:val="000000"/>
+                <w:sz w:val="20"/>
+                <w:szCs w:val="20"/>
+              </w:rPr>
+              <w:t xml:space="preserve">Es normal: toda cita nueva debe ser aprobada por el barbero antes de quedar confirmada. Recibirás una notificación en cuanto la apruebe.</w:t>
+            </w:r>
+          </w:p>
+        </w:tc>
+      </w:tr>
+      <w:tr>
+        <w:tc>
+          <w:tcPr>
+            <w:tcW w:type="auto" w:w="0"/>
+            <w:tcMar>
+              <w:top w:type="dxa" w:w="80"/>
+              <w:left w:type="dxa" w:w="120"/>
+              <w:bottom w:type="dxa" w:w="80"/>
+              <w:right w:type="dxa" w:w="120"/>
+            </w:tcMar>
+          </w:tcPr>
+          <w:p>
+            <w:r>
+              <w:rPr>
+                <w:b w:val="false"/>
+                <w:bCs w:val="false"/>
+                <w:color w:val="000000"/>
+                <w:sz w:val="20"/>
+                <w:szCs w:val="20"/>
+              </w:rPr>
+              <w:t xml:space="preserve">Quiero cancelar mi cita</w:t>
+            </w:r>
+          </w:p>
+        </w:tc>
+        <w:tc>
+          <w:tcPr>
+            <w:tcW w:type="auto" w:w="0"/>
+            <w:tcMar>
+              <w:top w:type="dxa" w:w="80"/>
+              <w:left w:type="dxa" w:w="120"/>
+              <w:bottom w:type="dxa" w:w="80"/>
+              <w:right w:type="dxa" w:w="120"/>
+            </w:tcMar>
+          </w:tcPr>
+          <w:p>
+            <w:r>
+              <w:rPr>
+                <w:b w:val="false"/>
+                <w:bCs w:val="false"/>
+                <w:color w:val="000000"/>
+                <w:sz w:val="20"/>
+                <w:szCs w:val="20"/>
+              </w:rPr>
+              <w:t xml:space="preserve">Desde Mis citas, mientras el servicio no haya comenzado. Revisa la política de cancelación en tu correo de confirmación (horas mínimas de anticipación).</w:t>
+            </w:r>
+          </w:p>
+        </w:tc>
+      </w:tr>
+      <w:tr>
+        <w:tc>
+          <w:tcPr>
+            <w:tcW w:type="auto" w:w="0"/>
+            <w:tcMar>
+              <w:top w:type="dxa" w:w="80"/>
+              <w:left w:type="dxa" w:w="120"/>
+              <w:bottom w:type="dxa" w:w="80"/>
+              <w:right w:type="dxa" w:w="120"/>
+            </w:tcMar>
+          </w:tcPr>
+          <w:p>
+            <w:r>
+              <w:rPr>
+                <w:b w:val="false"/>
+                <w:bCs w:val="false"/>
+                <w:color w:val="000000"/>
+                <w:sz w:val="20"/>
+                <w:szCs w:val="20"/>
+              </w:rPr>
+              <w:t xml:space="preserve">No me dejan cobrar una cita (recepción)</w:t>
+            </w:r>
+          </w:p>
+        </w:tc>
+        <w:tc>
+          <w:tcPr>
+            <w:tcW w:type="auto" w:w="0"/>
+            <w:tcMar>
+              <w:top w:type="dxa" w:w="80"/>
+              <w:left w:type="dxa" w:w="120"/>
+              <w:bottom w:type="dxa" w:w="80"/>
+              <w:right w:type="dxa" w:w="120"/>
+            </w:tcMar>
+          </w:tcPr>
+          <w:p>
+            <w:r>
+              <w:rPr>
+                <w:b w:val="false"/>
+                <w:bCs w:val="false"/>
+                <w:color w:val="000000"/>
+                <w:sz w:val="20"/>
+                <w:szCs w:val="20"/>
+              </w:rPr>
+              <w:t xml:space="preserve">Solo se pueden cobrar citas ya aprobadas por el barbero (confirmada, en proceso o completada). Si sigue "pendiente", pide al barbero que la apruebe primero.</w:t>
+            </w:r>
+          </w:p>
+        </w:tc>
+      </w:tr>
+      <w:tr>
+        <w:tc>
+          <w:tcPr>
+            <w:tcW w:type="auto" w:w="0"/>
+            <w:tcMar>
+              <w:top w:type="dxa" w:w="80"/>
+              <w:left w:type="dxa" w:w="120"/>
+              <w:bottom w:type="dxa" w:w="80"/>
+              <w:right w:type="dxa" w:w="120"/>
+            </w:tcMar>
+          </w:tcPr>
+          <w:p>
+            <w:r>
+              <w:rPr>
+                <w:b w:val="false"/>
+                <w:bCs w:val="false"/>
+                <w:color w:val="000000"/>
+                <w:sz w:val="20"/>
+                <w:szCs w:val="20"/>
+              </w:rPr>
+              <w:t xml:space="preserve">No veo la opción de Inventario/Usuarios</w:t>
+            </w:r>
+          </w:p>
+        </w:tc>
+        <w:tc>
+          <w:tcPr>
+            <w:tcW w:type="auto" w:w="0"/>
+            <w:tcMar>
+              <w:top w:type="dxa" w:w="80"/>
+              <w:left w:type="dxa" w:w="120"/>
+              <w:bottom w:type="dxa" w:w="80"/>
+              <w:right w:type="dxa" w:w="120"/>
+            </w:tcMar>
+          </w:tcPr>
+          <w:p>
+            <w:r>
+              <w:rPr>
+                <w:b w:val="false"/>
+                <w:bCs w:val="false"/>
+                <w:color w:val="000000"/>
+                <w:sz w:val="20"/>
+                <w:szCs w:val="20"/>
+              </w:rPr>
+              <w:t xml:space="preserve">Esas opciones son exclusivas del rol Administrador. Si crees que deberías tener acceso, contacta al administrador del sistema.</w:t>
+            </w:r>
+          </w:p>
+        </w:tc>
+      </w:tr>
+      <w:tr>
+        <w:tc>
+          <w:tcPr>
+            <w:tcW w:type="auto" w:w="0"/>
+            <w:tcMar>
+              <w:top w:type="dxa" w:w="80"/>
+              <w:left w:type="dxa" w:w="120"/>
+              <w:bottom w:type="dxa" w:w="80"/>
+              <w:right w:type="dxa" w:w="120"/>
+            </w:tcMar>
+          </w:tcPr>
+          <w:p>
+            <w:r>
+              <w:rPr>
+                <w:b w:val="false"/>
+                <w:bCs w:val="false"/>
+                <w:color w:val="000000"/>
+                <w:sz w:val="20"/>
+                <w:szCs w:val="20"/>
+              </w:rPr>
+              <w:t xml:space="preserve">No me llegan las notificaciones por correo</w:t>
+            </w:r>
+          </w:p>
+        </w:tc>
+        <w:tc>
+          <w:tcPr>
+            <w:tcW w:type="auto" w:w="0"/>
+            <w:tcMar>
+              <w:top w:type="dxa" w:w="80"/>
+              <w:left w:type="dxa" w:w="120"/>
+              <w:bottom w:type="dxa" w:w="80"/>
+              <w:right w:type="dxa" w:w="120"/>
+            </w:tcMar>
+          </w:tcPr>
+          <w:p>
+            <w:r>
+              <w:rPr>
+                <w:b w:val="false"/>
+                <w:bCs w:val="false"/>
+                <w:color w:val="000000"/>
+                <w:sz w:val="20"/>
+                <w:szCs w:val="20"/>
+              </w:rPr>
+              <w:t xml:space="preserve">Revisa tu carpeta de spam, y verifica en tu perfil → Preferencias de notificación que el canal de correo esté activado para ese tipo de evento.</w:t>
+            </w:r>
+          </w:p>
+        </w:tc>
+      </w:tr>
+      <w:tr>
+        <w:tc>
+          <w:tcPr>
+            <w:tcW w:type="auto" w:w="0"/>
+            <w:tcMar>
+              <w:top w:type="dxa" w:w="80"/>
+              <w:left w:type="dxa" w:w="120"/>
+              <w:bottom w:type="dxa" w:w="80"/>
+              <w:right w:type="dxa" w:w="120"/>
+            </w:tcMar>
+          </w:tcPr>
+          <w:p>
+            <w:r>
+              <w:rPr>
+                <w:b w:val="false"/>
+                <w:bCs w:val="false"/>
+                <w:color w:val="000000"/>
+                <w:sz w:val="20"/>
+                <w:szCs w:val="20"/>
+              </w:rPr>
+              <w:t xml:space="preserve">¿Cómo subo de nivel de lealtad?</w:t>
+            </w:r>
+          </w:p>
+        </w:tc>
+        <w:tc>
+          <w:tcPr>
+            <w:tcW w:type="auto" w:w="0"/>
+            <w:tcMar>
+              <w:top w:type="dxa" w:w="80"/>
+              <w:left w:type="dxa" w:w="120"/>
+              <w:bottom w:type="dxa" w:w="80"/>
+              <w:right w:type="dxa" w:w="120"/>
+            </w:tcMar>
+          </w:tcPr>
+          <w:p>
+            <w:r>
+              <w:rPr>
+                <w:b w:val="false"/>
+                <w:bCs w:val="false"/>
+                <w:color w:val="000000"/>
+                <w:sz w:val="20"/>
+                <w:szCs w:val="20"/>
+              </w:rPr>
+              <w:t xml:space="preserve">El nivel sube automáticamente según tu número de citas completadas: Nuevo → Regular (5 citas) → VIP (10 citas) → Leyenda (20 citas).</w:t>
+            </w:r>
+          </w:p>
+        </w:tc>
+      </w:tr>
+      <w:tr>
+        <w:tc>
+          <w:tcPr>
+            <w:tcW w:type="auto" w:w="0"/>
+            <w:tcMar>
+              <w:top w:type="dxa" w:w="80"/>
+              <w:left w:type="dxa" w:w="120"/>
+              <w:bottom w:type="dxa" w:w="80"/>
+              <w:right w:type="dxa" w:w="120"/>
+            </w:tcMar>
+          </w:tcPr>
+          <w:p>
+            <w:r>
+              <w:rPr>
+                <w:b w:val="false"/>
+                <w:bCs w:val="false"/>
+                <w:color w:val="000000"/>
+                <w:sz w:val="20"/>
+                <w:szCs w:val="20"/>
+              </w:rPr>
+              <w:t xml:space="preserve">Algo no carga o veo un error</w:t>
+            </w:r>
+          </w:p>
+        </w:tc>
+        <w:tc>
+          <w:tcPr>
+            <w:tcW w:type="auto" w:w="0"/>
+            <w:tcMar>
+              <w:top w:type="dxa" w:w="80"/>
+              <w:left w:type="dxa" w:w="120"/>
+              <w:bottom w:type="dxa" w:w="80"/>
+              <w:right w:type="dxa" w:w="120"/>
+            </w:tcMar>
+          </w:tcPr>
+          <w:p>
+            <w:r>
+              <w:rPr>
+                <w:b w:val="false"/>
+                <w:bCs w:val="false"/>
+                <w:color w:val="000000"/>
+                <w:sz w:val="20"/>
+                <w:szCs w:val="20"/>
+              </w:rPr>
+              <w:t xml:space="preserve">Contacta al administrador del sistema con una captura de pantalla — ayuda mucho a diagnosticar el problema rápido.</w:t>
+            </w:r>
+          </w:p>
+        </w:tc>
+      </w:tr>
+    </w:tbl>
     <w:sectPr>
       <w:headerReference w:type="default" r:id="rId7"/>
       <w:footerReference w:type="default" r:id="rId8"/>

</xml_diff>